<commit_message>
Math T7 : scènes IA uniques par leçon — moteur + lot 1 (U1 séances 1-10)
Co-authored-by: arena-agent <297053741+arena-agent@users.noreply.github.com>
</commit_message>
<xml_diff>
--- a/manuel-math-t7/Manuel_Mathematiques_T7_UNITE1.docx
+++ b/manuel-math-t7/Manuel_Mathematiques_T7_UNITE1.docx
@@ -3604,150 +3604,13 @@
     </w:p>
     <w:p>
       <w:pPr>
-        <w:spacing w:after="110" w:line="300"/>
-        <w:jc w:val="both"/>
-      </w:pPr>
-      <w:r>
-        <w:rPr>
-          <w:rFonts w:ascii="Times New Roman" w:cs="Times New Roman" w:eastAsia="Times New Roman" w:hAnsi="Times New Roman"/>
-          <w:b/>
-          <w:bCs/>
-          <w:i w:val="false"/>
-          <w:iCs w:val="false"/>
-          <w:color w:val="2E7D32"/>
-          <w:sz w:val="24"/>
-          <w:szCs w:val="24"/>
-        </w:rPr>
-        <w:t xml:space="preserve">Définition — </w:t>
-      </w:r>
-      <w:r>
-        <w:rPr>
-          <w:rFonts w:ascii="Times New Roman" w:cs="Times New Roman" w:eastAsia="Times New Roman" w:hAnsi="Times New Roman"/>
-          <w:b/>
-          <w:bCs/>
-          <w:i w:val="false"/>
-          <w:iCs w:val="false"/>
-          <w:color w:val="000000"/>
-          <w:sz w:val="24"/>
-          <w:szCs w:val="24"/>
-        </w:rPr>
-        <w:t xml:space="preserve">Décomposer un nombre décimal, c’est l’écrire sous la forme d’une somme d’un nombre entier et d’un nombre décimal plus petit que 1.</w:t>
-      </w:r>
-    </w:p>
-    <w:p>
-      <w:pPr>
-        <w:spacing w:after="110" w:line="300"/>
-        <w:jc w:val="both"/>
-      </w:pPr>
-      <w:r>
-        <w:rPr>
-          <w:rFonts w:ascii="Times New Roman" w:cs="Times New Roman" w:eastAsia="Times New Roman" w:hAnsi="Times New Roman"/>
-          <w:b/>
-          <w:bCs/>
-          <w:i w:val="false"/>
-          <w:iCs w:val="false"/>
-          <w:color w:val="1F4E79"/>
-          <w:sz w:val="24"/>
-          <w:szCs w:val="24"/>
-        </w:rPr>
-        <w:t xml:space="preserve">Autrement dit : </w:t>
-      </w:r>
-      <w:r>
-        <w:rPr>
-          <w:rFonts w:ascii="Times New Roman" w:cs="Times New Roman" w:eastAsia="Times New Roman" w:hAnsi="Times New Roman"/>
-          <w:b w:val="false"/>
-          <w:bCs w:val="false"/>
-          <w:i w:val="false"/>
-          <w:iCs w:val="false"/>
-          <w:color w:val="000000"/>
-          <w:sz w:val="24"/>
-          <w:szCs w:val="24"/>
-        </w:rPr>
-        <w:t xml:space="preserve">on sépare « les entiers » et « ce qui dépasse » : 7,35, c’est 7 entiers et encore 0,35.</w:t>
-      </w:r>
-    </w:p>
-    <w:p>
-      <w:pPr>
-        <w:spacing w:after="110" w:line="300"/>
-        <w:jc w:val="both"/>
-      </w:pPr>
-      <w:r>
-        <w:rPr>
-          <w:rFonts w:ascii="Times New Roman" w:cs="Times New Roman" w:eastAsia="Times New Roman" w:hAnsi="Times New Roman"/>
-          <w:b w:val="false"/>
-          <w:bCs w:val="false"/>
-          <w:i w:val="false"/>
-          <w:iCs w:val="false"/>
-          <w:color w:val="000000"/>
-          <w:sz w:val="24"/>
-          <w:szCs w:val="24"/>
-        </w:rPr>
-        <w:t xml:space="preserve">Tout nombre décimal est la somme de sa partie entière et de sa partie décimale. La partie entière s’écrit avant la virgule ; la partie décimale, toujours plus petite que 1, s’écrit après la virgule. Ainsi 7,35 = 7 + 0,35. On peut détailler davantage : 0,35 = </w:t>
-      </w:r>
-      <m:oMath>
-        <m:f>
-          <m:num>
-            <m:r>
-              <m:t>3</m:t>
-            </m:r>
-          </m:num>
-          <m:den>
-            <m:r>
-              <m:t>10</m:t>
-            </m:r>
-          </m:den>
-        </m:f>
-      </m:oMath>
-      <w:r>
-        <w:rPr>
-          <w:rFonts w:ascii="Times New Roman" w:cs="Times New Roman" w:eastAsia="Times New Roman" w:hAnsi="Times New Roman"/>
-          <w:b w:val="false"/>
-          <w:bCs w:val="false"/>
-          <w:i w:val="false"/>
-          <w:iCs w:val="false"/>
-          <w:color w:val="000000"/>
-          <w:sz w:val="24"/>
-          <w:szCs w:val="24"/>
-        </w:rPr>
-        <w:t xml:space="preserve">+ </w:t>
-      </w:r>
-      <m:oMath>
-        <m:f>
-          <m:num>
-            <m:r>
-              <m:t>5</m:t>
-            </m:r>
-          </m:num>
-          <m:den>
-            <m:r>
-              <m:t>100</m:t>
-            </m:r>
-          </m:den>
-        </m:f>
-      </m:oMath>
-      <w:r>
-        <w:rPr>
-          <w:rFonts w:ascii="Times New Roman" w:cs="Times New Roman" w:eastAsia="Times New Roman" w:hAnsi="Times New Roman"/>
-          <w:b w:val="false"/>
-          <w:bCs w:val="false"/>
-          <w:i w:val="false"/>
-          <w:iCs w:val="false"/>
-          <w:color w:val="000000"/>
-          <w:sz w:val="24"/>
-          <w:szCs w:val="24"/>
-        </w:rPr>
-        <w:t xml:space="preserve">.</w:t>
-      </w:r>
-    </w:p>
-    <w:p>
-      <w:pPr>
         <w:spacing w:after="120" w:before="120"/>
         <w:jc w:val="center"/>
       </w:pPr>
       <w:r>
         <w:drawing>
           <wp:inline distT="0" distB="0" distL="0" distR="0">
-            <wp:extent cx="4762500" cy="1495425"/>
+            <wp:extent cx="4095750" cy="2286000"/>
             <wp:effectExtent t="0" r="0" b="0" l="0"/>
             <wp:docPr id="2" name="" descr="" title=""/>
             <wp:cNvGraphicFramePr>
@@ -3764,6 +3627,189 @@
                   </pic:nvPicPr>
                   <pic:blipFill>
                     <a:blip r:embed="rId10" cstate="none"/>
+                    <a:srcRect/>
+                    <a:stretch>
+                      <a:fillRect/>
+                    </a:stretch>
+                  </pic:blipFill>
+                  <pic:spPr bwMode="auto">
+                    <a:xfrm>
+                      <a:off x="0" y="0"/>
+                      <a:ext cx="4095750" cy="2286000"/>
+                    </a:xfrm>
+                    <a:prstGeom prst="rect">
+                      <a:avLst/>
+                    </a:prstGeom>
+                  </pic:spPr>
+                </pic:pic>
+              </a:graphicData>
+            </a:graphic>
+          </wp:inline>
+        </w:drawing>
+      </w:r>
+    </w:p>
+    <w:p>
+      <w:pPr>
+        <w:spacing w:after="110" w:line="300"/>
+        <w:jc w:val="both"/>
+      </w:pPr>
+      <w:r>
+        <w:rPr>
+          <w:rFonts w:ascii="Times New Roman" w:cs="Times New Roman" w:eastAsia="Times New Roman" w:hAnsi="Times New Roman"/>
+          <w:b/>
+          <w:bCs/>
+          <w:i w:val="false"/>
+          <w:iCs w:val="false"/>
+          <w:color w:val="2E7D32"/>
+          <w:sz w:val="24"/>
+          <w:szCs w:val="24"/>
+        </w:rPr>
+        <w:t xml:space="preserve">Définition — </w:t>
+      </w:r>
+      <w:r>
+        <w:rPr>
+          <w:rFonts w:ascii="Times New Roman" w:cs="Times New Roman" w:eastAsia="Times New Roman" w:hAnsi="Times New Roman"/>
+          <w:b/>
+          <w:bCs/>
+          <w:i w:val="false"/>
+          <w:iCs w:val="false"/>
+          <w:color w:val="000000"/>
+          <w:sz w:val="24"/>
+          <w:szCs w:val="24"/>
+        </w:rPr>
+        <w:t xml:space="preserve">Décomposer un nombre décimal, c’est l’écrire sous la forme d’une somme d’un nombre entier et d’un nombre décimal plus petit que 1.</w:t>
+      </w:r>
+    </w:p>
+    <w:p>
+      <w:pPr>
+        <w:spacing w:after="110" w:line="300"/>
+        <w:jc w:val="both"/>
+      </w:pPr>
+      <w:r>
+        <w:rPr>
+          <w:rFonts w:ascii="Times New Roman" w:cs="Times New Roman" w:eastAsia="Times New Roman" w:hAnsi="Times New Roman"/>
+          <w:b/>
+          <w:bCs/>
+          <w:i w:val="false"/>
+          <w:iCs w:val="false"/>
+          <w:color w:val="1F4E79"/>
+          <w:sz w:val="24"/>
+          <w:szCs w:val="24"/>
+        </w:rPr>
+        <w:t xml:space="preserve">Autrement dit : </w:t>
+      </w:r>
+      <w:r>
+        <w:rPr>
+          <w:rFonts w:ascii="Times New Roman" w:cs="Times New Roman" w:eastAsia="Times New Roman" w:hAnsi="Times New Roman"/>
+          <w:b w:val="false"/>
+          <w:bCs w:val="false"/>
+          <w:i w:val="false"/>
+          <w:iCs w:val="false"/>
+          <w:color w:val="000000"/>
+          <w:sz w:val="24"/>
+          <w:szCs w:val="24"/>
+        </w:rPr>
+        <w:t xml:space="preserve">on sépare « les entiers » et « ce qui dépasse » : 7,35, c’est 7 entiers et encore 0,35.</w:t>
+      </w:r>
+    </w:p>
+    <w:p>
+      <w:pPr>
+        <w:spacing w:after="110" w:line="300"/>
+        <w:jc w:val="both"/>
+      </w:pPr>
+      <w:r>
+        <w:rPr>
+          <w:rFonts w:ascii="Times New Roman" w:cs="Times New Roman" w:eastAsia="Times New Roman" w:hAnsi="Times New Roman"/>
+          <w:b w:val="false"/>
+          <w:bCs w:val="false"/>
+          <w:i w:val="false"/>
+          <w:iCs w:val="false"/>
+          <w:color w:val="000000"/>
+          <w:sz w:val="24"/>
+          <w:szCs w:val="24"/>
+        </w:rPr>
+        <w:t xml:space="preserve">Tout nombre décimal est la somme de sa partie entière et de sa partie décimale. La partie entière s’écrit avant la virgule ; la partie décimale, toujours plus petite que 1, s’écrit après la virgule. Ainsi 7,35 = 7 + 0,35. On peut détailler davantage : 0,35 = </w:t>
+      </w:r>
+      <m:oMath>
+        <m:f>
+          <m:num>
+            <m:r>
+              <m:t>3</m:t>
+            </m:r>
+          </m:num>
+          <m:den>
+            <m:r>
+              <m:t>10</m:t>
+            </m:r>
+          </m:den>
+        </m:f>
+      </m:oMath>
+      <w:r>
+        <w:rPr>
+          <w:rFonts w:ascii="Times New Roman" w:cs="Times New Roman" w:eastAsia="Times New Roman" w:hAnsi="Times New Roman"/>
+          <w:b w:val="false"/>
+          <w:bCs w:val="false"/>
+          <w:i w:val="false"/>
+          <w:iCs w:val="false"/>
+          <w:color w:val="000000"/>
+          <w:sz w:val="24"/>
+          <w:szCs w:val="24"/>
+        </w:rPr>
+        <w:t xml:space="preserve">+ </w:t>
+      </w:r>
+      <m:oMath>
+        <m:f>
+          <m:num>
+            <m:r>
+              <m:t>5</m:t>
+            </m:r>
+          </m:num>
+          <m:den>
+            <m:r>
+              <m:t>100</m:t>
+            </m:r>
+          </m:den>
+        </m:f>
+      </m:oMath>
+      <w:r>
+        <w:rPr>
+          <w:rFonts w:ascii="Times New Roman" w:cs="Times New Roman" w:eastAsia="Times New Roman" w:hAnsi="Times New Roman"/>
+          <w:b w:val="false"/>
+          <w:bCs w:val="false"/>
+          <w:i w:val="false"/>
+          <w:iCs w:val="false"/>
+          <w:color w:val="000000"/>
+          <w:sz w:val="24"/>
+          <w:szCs w:val="24"/>
+        </w:rPr>
+        <w:t xml:space="preserve">.</w:t>
+      </w:r>
+    </w:p>
+    <w:p>
+      <w:pPr>
+        <w:spacing w:after="120" w:before="120"/>
+        <w:jc w:val="center"/>
+      </w:pPr>
+      <w:r>
+        <w:drawing>
+          <wp:inline distT="0" distB="0" distL="0" distR="0">
+            <wp:extent cx="4762500" cy="1495425"/>
+            <wp:effectExtent t="0" r="0" b="0" l="0"/>
+            <wp:docPr id="3" name="" descr="" title=""/>
+            <wp:cNvGraphicFramePr>
+              <a:graphicFrameLocks xmlns:a="http://schemas.openxmlformats.org/drawingml/2006/main" noChangeAspect="1"/>
+            </wp:cNvGraphicFramePr>
+            <a:graphic xmlns:a="http://schemas.openxmlformats.org/drawingml/2006/main">
+              <a:graphicData uri="http://schemas.openxmlformats.org/drawingml/2006/picture">
+                <pic:pic xmlns:pic="http://schemas.openxmlformats.org/drawingml/2006/picture">
+                  <pic:nvPicPr>
+                    <pic:cNvPr id="0" name="" descr=""/>
+                    <pic:cNvPicPr>
+                      <a:picLocks noChangeAspect="1" noChangeArrowheads="1"/>
+                    </pic:cNvPicPr>
+                  </pic:nvPicPr>
+                  <pic:blipFill>
+                    <a:blip r:embed="rId11" cstate="none"/>
                     <a:srcRect/>
                     <a:stretch>
                       <a:fillRect/>
@@ -6777,98 +6823,15 @@
     </w:p>
     <w:p>
       <w:pPr>
-        <w:spacing w:after="110" w:line="300"/>
-        <w:jc w:val="both"/>
-      </w:pPr>
-      <w:r>
-        <w:rPr>
-          <w:rFonts w:ascii="Times New Roman" w:cs="Times New Roman" w:eastAsia="Times New Roman" w:hAnsi="Times New Roman"/>
-          <w:b/>
-          <w:bCs/>
-          <w:i w:val="false"/>
-          <w:iCs w:val="false"/>
-          <w:color w:val="2E7D32"/>
-          <w:sz w:val="24"/>
-          <w:szCs w:val="24"/>
-        </w:rPr>
-        <w:t xml:space="preserve">Définition — </w:t>
-      </w:r>
-      <w:r>
-        <w:rPr>
-          <w:rFonts w:ascii="Times New Roman" w:cs="Times New Roman" w:eastAsia="Times New Roman" w:hAnsi="Times New Roman"/>
-          <w:b/>
-          <w:bCs/>
-          <w:i w:val="false"/>
-          <w:iCs w:val="false"/>
-          <w:color w:val="000000"/>
-          <w:sz w:val="24"/>
-          <w:szCs w:val="24"/>
-        </w:rPr>
-        <w:t xml:space="preserve">Composer un nombre décimal, c’est retrouver son écriture à virgule à partir d’une somme ou d’une différence d’un entier et d’un nombre décimal plus petit que 1.</w:t>
-      </w:r>
-    </w:p>
-    <w:p>
-      <w:pPr>
-        <w:spacing w:after="110" w:line="300"/>
-        <w:jc w:val="both"/>
-      </w:pPr>
-      <w:r>
-        <w:rPr>
-          <w:rFonts w:ascii="Times New Roman" w:cs="Times New Roman" w:eastAsia="Times New Roman" w:hAnsi="Times New Roman"/>
-          <w:b/>
-          <w:bCs/>
-          <w:i w:val="false"/>
-          <w:iCs w:val="false"/>
-          <w:color w:val="1F4E79"/>
-          <w:sz w:val="24"/>
-          <w:szCs w:val="24"/>
-        </w:rPr>
-        <w:t xml:space="preserve">Autrement dit : </w:t>
-      </w:r>
-      <w:r>
-        <w:rPr>
-          <w:rFonts w:ascii="Times New Roman" w:cs="Times New Roman" w:eastAsia="Times New Roman" w:hAnsi="Times New Roman"/>
-          <w:b w:val="false"/>
-          <w:bCs w:val="false"/>
-          <w:i w:val="false"/>
-          <w:iCs w:val="false"/>
-          <w:color w:val="000000"/>
-          <w:sz w:val="24"/>
-          <w:szCs w:val="24"/>
-        </w:rPr>
-        <w:t xml:space="preserve">c’est le chemin inverse de la décomposition : on recolle les morceaux. 8 − 0,25, c’est un peu moins que 8, donc 7,75.</w:t>
-      </w:r>
-    </w:p>
-    <w:p>
-      <w:pPr>
-        <w:spacing w:after="110" w:line="300"/>
-        <w:jc w:val="both"/>
-      </w:pPr>
-      <w:r>
-        <w:rPr>
-          <w:rFonts w:ascii="Times New Roman" w:cs="Times New Roman" w:eastAsia="Times New Roman" w:hAnsi="Times New Roman"/>
-          <w:b w:val="false"/>
-          <w:bCs w:val="false"/>
-          <w:i w:val="false"/>
-          <w:iCs w:val="false"/>
-          <w:color w:val="000000"/>
-          <w:sz w:val="24"/>
-          <w:szCs w:val="24"/>
-        </w:rPr>
-        <w:t xml:space="preserve">Pour composer une somme, on place la partie décimale derrière la virgule : 5 + 0,4 = 5,4. Pour composer une différence comme 8 − 0,25, on enlève 0,25 à 8 : le résultat 7,75 est juste en dessous de 8, et on vérifie que 7,75 + 0,25 = 8.</w:t>
-      </w:r>
-    </w:p>
-    <w:p>
-      <w:pPr>
         <w:spacing w:after="120" w:before="120"/>
         <w:jc w:val="center"/>
       </w:pPr>
       <w:r>
         <w:drawing>
           <wp:inline distT="0" distB="0" distL="0" distR="0">
-            <wp:extent cx="4762500" cy="1933575"/>
+            <wp:extent cx="4095750" cy="2286000"/>
             <wp:effectExtent t="0" r="0" b="0" l="0"/>
-            <wp:docPr id="3" name="" descr="" title=""/>
+            <wp:docPr id="4" name="" descr="" title=""/>
             <wp:cNvGraphicFramePr>
               <a:graphicFrameLocks xmlns:a="http://schemas.openxmlformats.org/drawingml/2006/main" noChangeAspect="1"/>
             </wp:cNvGraphicFramePr>
@@ -6882,7 +6845,136 @@
                     </pic:cNvPicPr>
                   </pic:nvPicPr>
                   <pic:blipFill>
-                    <a:blip r:embed="rId11" cstate="none"/>
+                    <a:blip r:embed="rId12" cstate="none"/>
+                    <a:srcRect/>
+                    <a:stretch>
+                      <a:fillRect/>
+                    </a:stretch>
+                  </pic:blipFill>
+                  <pic:spPr bwMode="auto">
+                    <a:xfrm>
+                      <a:off x="0" y="0"/>
+                      <a:ext cx="4095750" cy="2286000"/>
+                    </a:xfrm>
+                    <a:prstGeom prst="rect">
+                      <a:avLst/>
+                    </a:prstGeom>
+                  </pic:spPr>
+                </pic:pic>
+              </a:graphicData>
+            </a:graphic>
+          </wp:inline>
+        </w:drawing>
+      </w:r>
+    </w:p>
+    <w:p>
+      <w:pPr>
+        <w:spacing w:after="110" w:line="300"/>
+        <w:jc w:val="both"/>
+      </w:pPr>
+      <w:r>
+        <w:rPr>
+          <w:rFonts w:ascii="Times New Roman" w:cs="Times New Roman" w:eastAsia="Times New Roman" w:hAnsi="Times New Roman"/>
+          <w:b/>
+          <w:bCs/>
+          <w:i w:val="false"/>
+          <w:iCs w:val="false"/>
+          <w:color w:val="2E7D32"/>
+          <w:sz w:val="24"/>
+          <w:szCs w:val="24"/>
+        </w:rPr>
+        <w:t xml:space="preserve">Définition — </w:t>
+      </w:r>
+      <w:r>
+        <w:rPr>
+          <w:rFonts w:ascii="Times New Roman" w:cs="Times New Roman" w:eastAsia="Times New Roman" w:hAnsi="Times New Roman"/>
+          <w:b/>
+          <w:bCs/>
+          <w:i w:val="false"/>
+          <w:iCs w:val="false"/>
+          <w:color w:val="000000"/>
+          <w:sz w:val="24"/>
+          <w:szCs w:val="24"/>
+        </w:rPr>
+        <w:t xml:space="preserve">Composer un nombre décimal, c’est retrouver son écriture à virgule à partir d’une somme ou d’une différence d’un entier et d’un nombre décimal plus petit que 1.</w:t>
+      </w:r>
+    </w:p>
+    <w:p>
+      <w:pPr>
+        <w:spacing w:after="110" w:line="300"/>
+        <w:jc w:val="both"/>
+      </w:pPr>
+      <w:r>
+        <w:rPr>
+          <w:rFonts w:ascii="Times New Roman" w:cs="Times New Roman" w:eastAsia="Times New Roman" w:hAnsi="Times New Roman"/>
+          <w:b/>
+          <w:bCs/>
+          <w:i w:val="false"/>
+          <w:iCs w:val="false"/>
+          <w:color w:val="1F4E79"/>
+          <w:sz w:val="24"/>
+          <w:szCs w:val="24"/>
+        </w:rPr>
+        <w:t xml:space="preserve">Autrement dit : </w:t>
+      </w:r>
+      <w:r>
+        <w:rPr>
+          <w:rFonts w:ascii="Times New Roman" w:cs="Times New Roman" w:eastAsia="Times New Roman" w:hAnsi="Times New Roman"/>
+          <w:b w:val="false"/>
+          <w:bCs w:val="false"/>
+          <w:i w:val="false"/>
+          <w:iCs w:val="false"/>
+          <w:color w:val="000000"/>
+          <w:sz w:val="24"/>
+          <w:szCs w:val="24"/>
+        </w:rPr>
+        <w:t xml:space="preserve">c’est le chemin inverse de la décomposition : on recolle les morceaux. 8 − 0,25, c’est un peu moins que 8, donc 7,75.</w:t>
+      </w:r>
+    </w:p>
+    <w:p>
+      <w:pPr>
+        <w:spacing w:after="110" w:line="300"/>
+        <w:jc w:val="both"/>
+      </w:pPr>
+      <w:r>
+        <w:rPr>
+          <w:rFonts w:ascii="Times New Roman" w:cs="Times New Roman" w:eastAsia="Times New Roman" w:hAnsi="Times New Roman"/>
+          <w:b w:val="false"/>
+          <w:bCs w:val="false"/>
+          <w:i w:val="false"/>
+          <w:iCs w:val="false"/>
+          <w:color w:val="000000"/>
+          <w:sz w:val="24"/>
+          <w:szCs w:val="24"/>
+        </w:rPr>
+        <w:t xml:space="preserve">Pour composer une somme, on place la partie décimale derrière la virgule : 5 + 0,4 = 5,4. Pour composer une différence comme 8 − 0,25, on enlève 0,25 à 8 : le résultat 7,75 est juste en dessous de 8, et on vérifie que 7,75 + 0,25 = 8.</w:t>
+      </w:r>
+    </w:p>
+    <w:p>
+      <w:pPr>
+        <w:spacing w:after="120" w:before="120"/>
+        <w:jc w:val="center"/>
+      </w:pPr>
+      <w:r>
+        <w:drawing>
+          <wp:inline distT="0" distB="0" distL="0" distR="0">
+            <wp:extent cx="4762500" cy="1933575"/>
+            <wp:effectExtent t="0" r="0" b="0" l="0"/>
+            <wp:docPr id="5" name="" descr="" title=""/>
+            <wp:cNvGraphicFramePr>
+              <a:graphicFrameLocks xmlns:a="http://schemas.openxmlformats.org/drawingml/2006/main" noChangeAspect="1"/>
+            </wp:cNvGraphicFramePr>
+            <a:graphic xmlns:a="http://schemas.openxmlformats.org/drawingml/2006/main">
+              <a:graphicData uri="http://schemas.openxmlformats.org/drawingml/2006/picture">
+                <pic:pic xmlns:pic="http://schemas.openxmlformats.org/drawingml/2006/picture">
+                  <pic:nvPicPr>
+                    <pic:cNvPr id="0" name="" descr=""/>
+                    <pic:cNvPicPr>
+                      <a:picLocks noChangeAspect="1" noChangeArrowheads="1"/>
+                    </pic:cNvPicPr>
+                  </pic:nvPicPr>
+                  <pic:blipFill>
+                    <a:blip r:embed="rId13" cstate="none"/>
                     <a:srcRect/>
                     <a:stretch>
                       <a:fillRect/>
@@ -10585,206 +10677,15 @@
     </w:p>
     <w:p>
       <w:pPr>
-        <w:spacing w:after="110" w:line="300"/>
-        <w:jc w:val="both"/>
-      </w:pPr>
-      <w:r>
-        <w:rPr>
-          <w:rFonts w:ascii="Times New Roman" w:cs="Times New Roman" w:eastAsia="Times New Roman" w:hAnsi="Times New Roman"/>
-          <w:b/>
-          <w:bCs/>
-          <w:i w:val="false"/>
-          <w:iCs w:val="false"/>
-          <w:color w:val="2E7D32"/>
-          <w:sz w:val="24"/>
-          <w:szCs w:val="24"/>
-        </w:rPr>
-        <w:t xml:space="preserve">Définition — </w:t>
-      </w:r>
-      <w:r>
-        <w:rPr>
-          <w:rFonts w:ascii="Times New Roman" w:cs="Times New Roman" w:eastAsia="Times New Roman" w:hAnsi="Times New Roman"/>
-          <w:b/>
-          <w:bCs/>
-          <w:i w:val="false"/>
-          <w:iCs w:val="false"/>
-          <w:color w:val="000000"/>
-          <w:sz w:val="24"/>
-          <w:szCs w:val="24"/>
-        </w:rPr>
-        <w:t xml:space="preserve">Toute fraction dont le numérateur est supérieur au dénominateur peut s’écrire sous la forme m + f, où m est un nombre entier et f une fraction plus petite que 1.</w:t>
-      </w:r>
-    </w:p>
-    <w:p>
-      <w:pPr>
-        <w:spacing w:after="110" w:line="300"/>
-        <w:jc w:val="both"/>
-      </w:pPr>
-      <w:r>
-        <w:rPr>
-          <w:rFonts w:ascii="Times New Roman" w:cs="Times New Roman" w:eastAsia="Times New Roman" w:hAnsi="Times New Roman"/>
-          <w:b/>
-          <w:bCs/>
-          <w:i w:val="false"/>
-          <w:iCs w:val="false"/>
-          <w:color w:val="1F4E79"/>
-          <w:sz w:val="24"/>
-          <w:szCs w:val="24"/>
-        </w:rPr>
-        <w:t xml:space="preserve">Autrement dit : </w:t>
-      </w:r>
-      <w:r>
-        <w:rPr>
-          <w:rFonts w:ascii="Times New Roman" w:cs="Times New Roman" w:eastAsia="Times New Roman" w:hAnsi="Times New Roman"/>
-          <w:b w:val="false"/>
-          <w:bCs w:val="false"/>
-          <w:i w:val="false"/>
-          <w:iCs w:val="false"/>
-          <w:color w:val="000000"/>
-          <w:sz w:val="24"/>
-          <w:szCs w:val="24"/>
-        </w:rPr>
-        <w:t xml:space="preserve">11 quarts, c’est 2 touts complets et encore 3 quarts : </w:t>
-      </w:r>
-      <m:oMath>
-        <m:f>
-          <m:num>
-            <m:r>
-              <m:t>11</m:t>
-            </m:r>
-          </m:num>
-          <m:den>
-            <m:r>
-              <m:t>4</m:t>
-            </m:r>
-          </m:den>
-        </m:f>
-      </m:oMath>
-      <w:r>
-        <w:rPr>
-          <w:rFonts w:ascii="Times New Roman" w:cs="Times New Roman" w:eastAsia="Times New Roman" w:hAnsi="Times New Roman"/>
-          <w:b w:val="false"/>
-          <w:bCs w:val="false"/>
-          <w:i w:val="false"/>
-          <w:iCs w:val="false"/>
-          <w:color w:val="000000"/>
-          <w:sz w:val="24"/>
-          <w:szCs w:val="24"/>
-        </w:rPr>
-        <w:t xml:space="preserve">= 2 + </w:t>
-      </w:r>
-      <m:oMath>
-        <m:f>
-          <m:num>
-            <m:r>
-              <m:t>3</m:t>
-            </m:r>
-          </m:num>
-          <m:den>
-            <m:r>
-              <m:t>4</m:t>
-            </m:r>
-          </m:den>
-        </m:f>
-      </m:oMath>
-      <w:r>
-        <w:rPr>
-          <w:rFonts w:ascii="Times New Roman" w:cs="Times New Roman" w:eastAsia="Times New Roman" w:hAnsi="Times New Roman"/>
-          <w:b w:val="false"/>
-          <w:bCs w:val="false"/>
-          <w:i w:val="false"/>
-          <w:iCs w:val="false"/>
-          <w:color w:val="000000"/>
-          <w:sz w:val="24"/>
-          <w:szCs w:val="24"/>
-        </w:rPr>
-        <w:t xml:space="preserve">.</w:t>
-      </w:r>
-    </w:p>
-    <w:p>
-      <w:pPr>
-        <w:spacing w:after="110" w:line="300"/>
-        <w:jc w:val="both"/>
-      </w:pPr>
-      <w:r>
-        <w:rPr>
-          <w:rFonts w:ascii="Times New Roman" w:cs="Times New Roman" w:eastAsia="Times New Roman" w:hAnsi="Times New Roman"/>
-          <w:b w:val="false"/>
-          <w:bCs w:val="false"/>
-          <w:i w:val="false"/>
-          <w:iCs w:val="false"/>
-          <w:color w:val="000000"/>
-          <w:sz w:val="24"/>
-          <w:szCs w:val="24"/>
-        </w:rPr>
-        <w:t xml:space="preserve">Pour décomposer une fraction, on effectue la division euclidienne du numérateur par le dénominateur : le quotient donne la partie entière et le reste devient le numérateur de la fraction restante. Ainsi 11 ÷ 4 = 2 reste 3, donc </w:t>
-      </w:r>
-      <m:oMath>
-        <m:f>
-          <m:num>
-            <m:r>
-              <m:t>11</m:t>
-            </m:r>
-          </m:num>
-          <m:den>
-            <m:r>
-              <m:t>4</m:t>
-            </m:r>
-          </m:den>
-        </m:f>
-      </m:oMath>
-      <w:r>
-        <w:rPr>
-          <w:rFonts w:ascii="Times New Roman" w:cs="Times New Roman" w:eastAsia="Times New Roman" w:hAnsi="Times New Roman"/>
-          <w:b w:val="false"/>
-          <w:bCs w:val="false"/>
-          <w:i w:val="false"/>
-          <w:iCs w:val="false"/>
-          <w:color w:val="000000"/>
-          <w:sz w:val="24"/>
-          <w:szCs w:val="24"/>
-        </w:rPr>
-        <w:t xml:space="preserve">= 2 + </w:t>
-      </w:r>
-      <m:oMath>
-        <m:f>
-          <m:num>
-            <m:r>
-              <m:t>3</m:t>
-            </m:r>
-          </m:num>
-          <m:den>
-            <m:r>
-              <m:t>4</m:t>
-            </m:r>
-          </m:den>
-        </m:f>
-      </m:oMath>
-      <w:r>
-        <w:rPr>
-          <w:rFonts w:ascii="Times New Roman" w:cs="Times New Roman" w:eastAsia="Times New Roman" w:hAnsi="Times New Roman"/>
-          <w:b w:val="false"/>
-          <w:bCs w:val="false"/>
-          <w:i w:val="false"/>
-          <w:iCs w:val="false"/>
-          <w:color w:val="000000"/>
-          <w:sz w:val="24"/>
-          <w:szCs w:val="24"/>
-        </w:rPr>
-        <w:t xml:space="preserve">.</w:t>
-      </w:r>
-    </w:p>
-    <w:p>
-      <w:pPr>
         <w:spacing w:after="120" w:before="120"/>
         <w:jc w:val="center"/>
       </w:pPr>
       <w:r>
         <w:drawing>
           <wp:inline distT="0" distB="0" distL="0" distR="0">
-            <wp:extent cx="4762500" cy="1409700"/>
+            <wp:extent cx="4095750" cy="2286000"/>
             <wp:effectExtent t="0" r="0" b="0" l="0"/>
-            <wp:docPr id="4" name="" descr="" title=""/>
+            <wp:docPr id="6" name="" descr="" title=""/>
             <wp:cNvGraphicFramePr>
               <a:graphicFrameLocks xmlns:a="http://schemas.openxmlformats.org/drawingml/2006/main" noChangeAspect="1"/>
             </wp:cNvGraphicFramePr>
@@ -10798,7 +10699,244 @@
                     </pic:cNvPicPr>
                   </pic:nvPicPr>
                   <pic:blipFill>
-                    <a:blip r:embed="rId12" cstate="none"/>
+                    <a:blip r:embed="rId14" cstate="none"/>
+                    <a:srcRect/>
+                    <a:stretch>
+                      <a:fillRect/>
+                    </a:stretch>
+                  </pic:blipFill>
+                  <pic:spPr bwMode="auto">
+                    <a:xfrm>
+                      <a:off x="0" y="0"/>
+                      <a:ext cx="4095750" cy="2286000"/>
+                    </a:xfrm>
+                    <a:prstGeom prst="rect">
+                      <a:avLst/>
+                    </a:prstGeom>
+                  </pic:spPr>
+                </pic:pic>
+              </a:graphicData>
+            </a:graphic>
+          </wp:inline>
+        </w:drawing>
+      </w:r>
+    </w:p>
+    <w:p>
+      <w:pPr>
+        <w:spacing w:after="110" w:line="300"/>
+        <w:jc w:val="both"/>
+      </w:pPr>
+      <w:r>
+        <w:rPr>
+          <w:rFonts w:ascii="Times New Roman" w:cs="Times New Roman" w:eastAsia="Times New Roman" w:hAnsi="Times New Roman"/>
+          <w:b/>
+          <w:bCs/>
+          <w:i w:val="false"/>
+          <w:iCs w:val="false"/>
+          <w:color w:val="2E7D32"/>
+          <w:sz w:val="24"/>
+          <w:szCs w:val="24"/>
+        </w:rPr>
+        <w:t xml:space="preserve">Définition — </w:t>
+      </w:r>
+      <w:r>
+        <w:rPr>
+          <w:rFonts w:ascii="Times New Roman" w:cs="Times New Roman" w:eastAsia="Times New Roman" w:hAnsi="Times New Roman"/>
+          <w:b/>
+          <w:bCs/>
+          <w:i w:val="false"/>
+          <w:iCs w:val="false"/>
+          <w:color w:val="000000"/>
+          <w:sz w:val="24"/>
+          <w:szCs w:val="24"/>
+        </w:rPr>
+        <w:t xml:space="preserve">Toute fraction dont le numérateur est supérieur au dénominateur peut s’écrire sous la forme m + f, où m est un nombre entier et f une fraction plus petite que 1.</w:t>
+      </w:r>
+    </w:p>
+    <w:p>
+      <w:pPr>
+        <w:spacing w:after="110" w:line="300"/>
+        <w:jc w:val="both"/>
+      </w:pPr>
+      <w:r>
+        <w:rPr>
+          <w:rFonts w:ascii="Times New Roman" w:cs="Times New Roman" w:eastAsia="Times New Roman" w:hAnsi="Times New Roman"/>
+          <w:b/>
+          <w:bCs/>
+          <w:i w:val="false"/>
+          <w:iCs w:val="false"/>
+          <w:color w:val="1F4E79"/>
+          <w:sz w:val="24"/>
+          <w:szCs w:val="24"/>
+        </w:rPr>
+        <w:t xml:space="preserve">Autrement dit : </w:t>
+      </w:r>
+      <w:r>
+        <w:rPr>
+          <w:rFonts w:ascii="Times New Roman" w:cs="Times New Roman" w:eastAsia="Times New Roman" w:hAnsi="Times New Roman"/>
+          <w:b w:val="false"/>
+          <w:bCs w:val="false"/>
+          <w:i w:val="false"/>
+          <w:iCs w:val="false"/>
+          <w:color w:val="000000"/>
+          <w:sz w:val="24"/>
+          <w:szCs w:val="24"/>
+        </w:rPr>
+        <w:t xml:space="preserve">11 quarts, c’est 2 touts complets et encore 3 quarts : </w:t>
+      </w:r>
+      <m:oMath>
+        <m:f>
+          <m:num>
+            <m:r>
+              <m:t>11</m:t>
+            </m:r>
+          </m:num>
+          <m:den>
+            <m:r>
+              <m:t>4</m:t>
+            </m:r>
+          </m:den>
+        </m:f>
+      </m:oMath>
+      <w:r>
+        <w:rPr>
+          <w:rFonts w:ascii="Times New Roman" w:cs="Times New Roman" w:eastAsia="Times New Roman" w:hAnsi="Times New Roman"/>
+          <w:b w:val="false"/>
+          <w:bCs w:val="false"/>
+          <w:i w:val="false"/>
+          <w:iCs w:val="false"/>
+          <w:color w:val="000000"/>
+          <w:sz w:val="24"/>
+          <w:szCs w:val="24"/>
+        </w:rPr>
+        <w:t xml:space="preserve">= 2 + </w:t>
+      </w:r>
+      <m:oMath>
+        <m:f>
+          <m:num>
+            <m:r>
+              <m:t>3</m:t>
+            </m:r>
+          </m:num>
+          <m:den>
+            <m:r>
+              <m:t>4</m:t>
+            </m:r>
+          </m:den>
+        </m:f>
+      </m:oMath>
+      <w:r>
+        <w:rPr>
+          <w:rFonts w:ascii="Times New Roman" w:cs="Times New Roman" w:eastAsia="Times New Roman" w:hAnsi="Times New Roman"/>
+          <w:b w:val="false"/>
+          <w:bCs w:val="false"/>
+          <w:i w:val="false"/>
+          <w:iCs w:val="false"/>
+          <w:color w:val="000000"/>
+          <w:sz w:val="24"/>
+          <w:szCs w:val="24"/>
+        </w:rPr>
+        <w:t xml:space="preserve">.</w:t>
+      </w:r>
+    </w:p>
+    <w:p>
+      <w:pPr>
+        <w:spacing w:after="110" w:line="300"/>
+        <w:jc w:val="both"/>
+      </w:pPr>
+      <w:r>
+        <w:rPr>
+          <w:rFonts w:ascii="Times New Roman" w:cs="Times New Roman" w:eastAsia="Times New Roman" w:hAnsi="Times New Roman"/>
+          <w:b w:val="false"/>
+          <w:bCs w:val="false"/>
+          <w:i w:val="false"/>
+          <w:iCs w:val="false"/>
+          <w:color w:val="000000"/>
+          <w:sz w:val="24"/>
+          <w:szCs w:val="24"/>
+        </w:rPr>
+        <w:t xml:space="preserve">Pour décomposer une fraction, on effectue la division euclidienne du numérateur par le dénominateur : le quotient donne la partie entière et le reste devient le numérateur de la fraction restante. Ainsi 11 ÷ 4 = 2 reste 3, donc </w:t>
+      </w:r>
+      <m:oMath>
+        <m:f>
+          <m:num>
+            <m:r>
+              <m:t>11</m:t>
+            </m:r>
+          </m:num>
+          <m:den>
+            <m:r>
+              <m:t>4</m:t>
+            </m:r>
+          </m:den>
+        </m:f>
+      </m:oMath>
+      <w:r>
+        <w:rPr>
+          <w:rFonts w:ascii="Times New Roman" w:cs="Times New Roman" w:eastAsia="Times New Roman" w:hAnsi="Times New Roman"/>
+          <w:b w:val="false"/>
+          <w:bCs w:val="false"/>
+          <w:i w:val="false"/>
+          <w:iCs w:val="false"/>
+          <w:color w:val="000000"/>
+          <w:sz w:val="24"/>
+          <w:szCs w:val="24"/>
+        </w:rPr>
+        <w:t xml:space="preserve">= 2 + </w:t>
+      </w:r>
+      <m:oMath>
+        <m:f>
+          <m:num>
+            <m:r>
+              <m:t>3</m:t>
+            </m:r>
+          </m:num>
+          <m:den>
+            <m:r>
+              <m:t>4</m:t>
+            </m:r>
+          </m:den>
+        </m:f>
+      </m:oMath>
+      <w:r>
+        <w:rPr>
+          <w:rFonts w:ascii="Times New Roman" w:cs="Times New Roman" w:eastAsia="Times New Roman" w:hAnsi="Times New Roman"/>
+          <w:b w:val="false"/>
+          <w:bCs w:val="false"/>
+          <w:i w:val="false"/>
+          <w:iCs w:val="false"/>
+          <w:color w:val="000000"/>
+          <w:sz w:val="24"/>
+          <w:szCs w:val="24"/>
+        </w:rPr>
+        <w:t xml:space="preserve">.</w:t>
+      </w:r>
+    </w:p>
+    <w:p>
+      <w:pPr>
+        <w:spacing w:after="120" w:before="120"/>
+        <w:jc w:val="center"/>
+      </w:pPr>
+      <w:r>
+        <w:drawing>
+          <wp:inline distT="0" distB="0" distL="0" distR="0">
+            <wp:extent cx="4762500" cy="1409700"/>
+            <wp:effectExtent t="0" r="0" b="0" l="0"/>
+            <wp:docPr id="7" name="" descr="" title=""/>
+            <wp:cNvGraphicFramePr>
+              <a:graphicFrameLocks xmlns:a="http://schemas.openxmlformats.org/drawingml/2006/main" noChangeAspect="1"/>
+            </wp:cNvGraphicFramePr>
+            <a:graphic xmlns:a="http://schemas.openxmlformats.org/drawingml/2006/main">
+              <a:graphicData uri="http://schemas.openxmlformats.org/drawingml/2006/picture">
+                <pic:pic xmlns:pic="http://schemas.openxmlformats.org/drawingml/2006/picture">
+                  <pic:nvPicPr>
+                    <pic:cNvPr id="0" name="" descr=""/>
+                    <pic:cNvPicPr>
+                      <a:picLocks noChangeAspect="1" noChangeArrowheads="1"/>
+                    </pic:cNvPicPr>
+                  </pic:nvPicPr>
+                  <pic:blipFill>
+                    <a:blip r:embed="rId15" cstate="none"/>
                     <a:srcRect/>
                     <a:stretch>
                       <a:fillRect/>
@@ -15676,341 +15814,15 @@
     </w:p>
     <w:p>
       <w:pPr>
-        <w:spacing w:after="110" w:line="300"/>
-        <w:jc w:val="both"/>
-      </w:pPr>
-      <w:r>
-        <w:rPr>
-          <w:rFonts w:ascii="Times New Roman" w:cs="Times New Roman" w:eastAsia="Times New Roman" w:hAnsi="Times New Roman"/>
-          <w:b/>
-          <w:bCs/>
-          <w:i w:val="false"/>
-          <w:iCs w:val="false"/>
-          <w:color w:val="2E7D32"/>
-          <w:sz w:val="24"/>
-          <w:szCs w:val="24"/>
-        </w:rPr>
-        <w:t xml:space="preserve">Définition — </w:t>
-      </w:r>
-      <w:r>
-        <w:rPr>
-          <w:rFonts w:ascii="Times New Roman" w:cs="Times New Roman" w:eastAsia="Times New Roman" w:hAnsi="Times New Roman"/>
-          <w:b/>
-          <w:bCs/>
-          <w:i w:val="false"/>
-          <w:iCs w:val="false"/>
-          <w:color w:val="000000"/>
-          <w:sz w:val="24"/>
-          <w:szCs w:val="24"/>
-        </w:rPr>
-        <w:t xml:space="preserve">Deux fractions sont équivalentes lorsqu’elles représentent la même part d’un même tout. On obtient une fraction équivalente en multipliant ou en divisant le numérateur et le dénominateur par un même nombre non nul.</w:t>
-      </w:r>
-    </w:p>
-    <w:p>
-      <w:pPr>
-        <w:spacing w:after="110" w:line="300"/>
-        <w:jc w:val="both"/>
-      </w:pPr>
-      <w:r>
-        <w:rPr>
-          <w:rFonts w:ascii="Times New Roman" w:cs="Times New Roman" w:eastAsia="Times New Roman" w:hAnsi="Times New Roman"/>
-          <w:b/>
-          <w:bCs/>
-          <w:i w:val="false"/>
-          <w:iCs w:val="false"/>
-          <w:color w:val="1F4E79"/>
-          <w:sz w:val="24"/>
-          <w:szCs w:val="24"/>
-        </w:rPr>
-        <w:t xml:space="preserve">Autrement dit : </w:t>
-      </w:r>
-      <w:r>
-        <w:rPr>
-          <w:rFonts w:ascii="Times New Roman" w:cs="Times New Roman" w:eastAsia="Times New Roman" w:hAnsi="Times New Roman"/>
-          <w:b w:val="false"/>
-          <w:bCs w:val="false"/>
-          <w:i w:val="false"/>
-          <w:iCs w:val="false"/>
-          <w:color w:val="000000"/>
-          <w:sz w:val="24"/>
-          <w:szCs w:val="24"/>
-        </w:rPr>
-        <w:t xml:space="preserve">couper chaque part en deux ne change pas la quantité mangée : </w:t>
-      </w:r>
-      <m:oMath>
-        <m:f>
-          <m:num>
-            <m:r>
-              <m:t>2</m:t>
-            </m:r>
-          </m:num>
-          <m:den>
-            <m:r>
-              <m:t>3</m:t>
-            </m:r>
-          </m:den>
-        </m:f>
-      </m:oMath>
-      <w:r>
-        <w:rPr>
-          <w:rFonts w:ascii="Times New Roman" w:cs="Times New Roman" w:eastAsia="Times New Roman" w:hAnsi="Times New Roman"/>
-          <w:b w:val="false"/>
-          <w:bCs w:val="false"/>
-          <w:i w:val="false"/>
-          <w:iCs w:val="false"/>
-          <w:color w:val="000000"/>
-          <w:sz w:val="24"/>
-          <w:szCs w:val="24"/>
-        </w:rPr>
-        <w:t xml:space="preserve">et </w:t>
-      </w:r>
-      <m:oMath>
-        <m:f>
-          <m:num>
-            <m:r>
-              <m:t>4</m:t>
-            </m:r>
-          </m:num>
-          <m:den>
-            <m:r>
-              <m:t>6</m:t>
-            </m:r>
-          </m:den>
-        </m:f>
-      </m:oMath>
-      <w:r>
-        <w:rPr>
-          <w:rFonts w:ascii="Times New Roman" w:cs="Times New Roman" w:eastAsia="Times New Roman" w:hAnsi="Times New Roman"/>
-          <w:b w:val="false"/>
-          <w:bCs w:val="false"/>
-          <w:i w:val="false"/>
-          <w:iCs w:val="false"/>
-          <w:color w:val="000000"/>
-          <w:sz w:val="24"/>
-          <w:szCs w:val="24"/>
-        </w:rPr>
-        <w:t xml:space="preserve">, c’est pareil.</w:t>
-      </w:r>
-    </w:p>
-    <w:p>
-      <w:pPr>
-        <w:spacing w:after="110" w:line="300"/>
-        <w:jc w:val="both"/>
-      </w:pPr>
-      <w:r>
-        <w:rPr>
-          <w:rFonts w:ascii="Times New Roman" w:cs="Times New Roman" w:eastAsia="Times New Roman" w:hAnsi="Times New Roman"/>
-          <w:b w:val="false"/>
-          <w:bCs w:val="false"/>
-          <w:i w:val="false"/>
-          <w:iCs w:val="false"/>
-          <w:color w:val="000000"/>
-          <w:sz w:val="24"/>
-          <w:szCs w:val="24"/>
-        </w:rPr>
-        <w:t xml:space="preserve">Sur les bandes fractionnées, </w:t>
-      </w:r>
-      <m:oMath>
-        <m:f>
-          <m:num>
-            <m:r>
-              <m:t>2</m:t>
-            </m:r>
-          </m:num>
-          <m:den>
-            <m:r>
-              <m:t>3</m:t>
-            </m:r>
-          </m:den>
-        </m:f>
-      </m:oMath>
-      <w:r>
-        <w:rPr>
-          <w:rFonts w:ascii="Times New Roman" w:cs="Times New Roman" w:eastAsia="Times New Roman" w:hAnsi="Times New Roman"/>
-          <w:b w:val="false"/>
-          <w:bCs w:val="false"/>
-          <w:i w:val="false"/>
-          <w:iCs w:val="false"/>
-          <w:color w:val="000000"/>
-          <w:sz w:val="24"/>
-          <w:szCs w:val="24"/>
-        </w:rPr>
-        <w:t xml:space="preserve">, </w:t>
-      </w:r>
-      <m:oMath>
-        <m:f>
-          <m:num>
-            <m:r>
-              <m:t>4</m:t>
-            </m:r>
-          </m:num>
-          <m:den>
-            <m:r>
-              <m:t>6</m:t>
-            </m:r>
-          </m:den>
-        </m:f>
-      </m:oMath>
-      <w:r>
-        <w:rPr>
-          <w:rFonts w:ascii="Times New Roman" w:cs="Times New Roman" w:eastAsia="Times New Roman" w:hAnsi="Times New Roman"/>
-          <w:b w:val="false"/>
-          <w:bCs w:val="false"/>
-          <w:i w:val="false"/>
-          <w:iCs w:val="false"/>
-          <w:color w:val="000000"/>
-          <w:sz w:val="24"/>
-          <w:szCs w:val="24"/>
-        </w:rPr>
-        <w:t xml:space="preserve">et </w:t>
-      </w:r>
-      <m:oMath>
-        <m:f>
-          <m:num>
-            <m:r>
-              <m:t>8</m:t>
-            </m:r>
-          </m:num>
-          <m:den>
-            <m:r>
-              <m:t>12</m:t>
-            </m:r>
-          </m:den>
-        </m:f>
-      </m:oMath>
-      <w:r>
-        <w:rPr>
-          <w:rFonts w:ascii="Times New Roman" w:cs="Times New Roman" w:eastAsia="Times New Roman" w:hAnsi="Times New Roman"/>
-          <w:b w:val="false"/>
-          <w:bCs w:val="false"/>
-          <w:i w:val="false"/>
-          <w:iCs w:val="false"/>
-          <w:color w:val="000000"/>
-          <w:sz w:val="24"/>
-          <w:szCs w:val="24"/>
-        </w:rPr>
-        <w:t xml:space="preserve">colorient exactement la même longueur : ces fractions sont équivalentes. En calcul, on passe de </w:t>
-      </w:r>
-      <m:oMath>
-        <m:f>
-          <m:num>
-            <m:r>
-              <m:t>2</m:t>
-            </m:r>
-          </m:num>
-          <m:den>
-            <m:r>
-              <m:t>3</m:t>
-            </m:r>
-          </m:den>
-        </m:f>
-      </m:oMath>
-      <w:r>
-        <w:rPr>
-          <w:rFonts w:ascii="Times New Roman" w:cs="Times New Roman" w:eastAsia="Times New Roman" w:hAnsi="Times New Roman"/>
-          <w:b w:val="false"/>
-          <w:bCs w:val="false"/>
-          <w:i w:val="false"/>
-          <w:iCs w:val="false"/>
-          <w:color w:val="000000"/>
-          <w:sz w:val="24"/>
-          <w:szCs w:val="24"/>
-        </w:rPr>
-        <w:t xml:space="preserve">à </w:t>
-      </w:r>
-      <m:oMath>
-        <m:f>
-          <m:num>
-            <m:r>
-              <m:t>4</m:t>
-            </m:r>
-          </m:num>
-          <m:den>
-            <m:r>
-              <m:t>6</m:t>
-            </m:r>
-          </m:den>
-        </m:f>
-      </m:oMath>
-      <w:r>
-        <w:rPr>
-          <w:rFonts w:ascii="Times New Roman" w:cs="Times New Roman" w:eastAsia="Times New Roman" w:hAnsi="Times New Roman"/>
-          <w:b w:val="false"/>
-          <w:bCs w:val="false"/>
-          <w:i w:val="false"/>
-          <w:iCs w:val="false"/>
-          <w:color w:val="000000"/>
-          <w:sz w:val="24"/>
-          <w:szCs w:val="24"/>
-        </w:rPr>
-        <w:t xml:space="preserve">en multipliant le numérateur et le dénominateur par 2, et de </w:t>
-      </w:r>
-      <m:oMath>
-        <m:f>
-          <m:num>
-            <m:r>
-              <m:t>4</m:t>
-            </m:r>
-          </m:num>
-          <m:den>
-            <m:r>
-              <m:t>6</m:t>
-            </m:r>
-          </m:den>
-        </m:f>
-      </m:oMath>
-      <w:r>
-        <w:rPr>
-          <w:rFonts w:ascii="Times New Roman" w:cs="Times New Roman" w:eastAsia="Times New Roman" w:hAnsi="Times New Roman"/>
-          <w:b w:val="false"/>
-          <w:bCs w:val="false"/>
-          <w:i w:val="false"/>
-          <w:iCs w:val="false"/>
-          <w:color w:val="000000"/>
-          <w:sz w:val="24"/>
-          <w:szCs w:val="24"/>
-        </w:rPr>
-        <w:t xml:space="preserve">à </w:t>
-      </w:r>
-      <m:oMath>
-        <m:f>
-          <m:num>
-            <m:r>
-              <m:t>8</m:t>
-            </m:r>
-          </m:num>
-          <m:den>
-            <m:r>
-              <m:t>12</m:t>
-            </m:r>
-          </m:den>
-        </m:f>
-      </m:oMath>
-      <w:r>
-        <w:rPr>
-          <w:rFonts w:ascii="Times New Roman" w:cs="Times New Roman" w:eastAsia="Times New Roman" w:hAnsi="Times New Roman"/>
-          <w:b w:val="false"/>
-          <w:bCs w:val="false"/>
-          <w:i w:val="false"/>
-          <w:iCs w:val="false"/>
-          <w:color w:val="000000"/>
-          <w:sz w:val="24"/>
-          <w:szCs w:val="24"/>
-        </w:rPr>
-        <w:t xml:space="preserve">en les multipliant encore par 2.</w:t>
-      </w:r>
-    </w:p>
-    <w:p>
-      <w:pPr>
         <w:spacing w:after="120" w:before="120"/>
         <w:jc w:val="center"/>
       </w:pPr>
       <w:r>
         <w:drawing>
           <wp:inline distT="0" distB="0" distL="0" distR="0">
-            <wp:extent cx="4762500" cy="2019300"/>
+            <wp:extent cx="4095750" cy="2286000"/>
             <wp:effectExtent t="0" r="0" b="0" l="0"/>
-            <wp:docPr id="5" name="" descr="" title=""/>
+            <wp:docPr id="8" name="" descr="" title=""/>
             <wp:cNvGraphicFramePr>
               <a:graphicFrameLocks xmlns:a="http://schemas.openxmlformats.org/drawingml/2006/main" noChangeAspect="1"/>
             </wp:cNvGraphicFramePr>
@@ -16024,7 +15836,379 @@
                     </pic:cNvPicPr>
                   </pic:nvPicPr>
                   <pic:blipFill>
-                    <a:blip r:embed="rId13" cstate="none"/>
+                    <a:blip r:embed="rId16" cstate="none"/>
+                    <a:srcRect/>
+                    <a:stretch>
+                      <a:fillRect/>
+                    </a:stretch>
+                  </pic:blipFill>
+                  <pic:spPr bwMode="auto">
+                    <a:xfrm>
+                      <a:off x="0" y="0"/>
+                      <a:ext cx="4095750" cy="2286000"/>
+                    </a:xfrm>
+                    <a:prstGeom prst="rect">
+                      <a:avLst/>
+                    </a:prstGeom>
+                  </pic:spPr>
+                </pic:pic>
+              </a:graphicData>
+            </a:graphic>
+          </wp:inline>
+        </w:drawing>
+      </w:r>
+    </w:p>
+    <w:p>
+      <w:pPr>
+        <w:spacing w:after="110" w:line="300"/>
+        <w:jc w:val="both"/>
+      </w:pPr>
+      <w:r>
+        <w:rPr>
+          <w:rFonts w:ascii="Times New Roman" w:cs="Times New Roman" w:eastAsia="Times New Roman" w:hAnsi="Times New Roman"/>
+          <w:b/>
+          <w:bCs/>
+          <w:i w:val="false"/>
+          <w:iCs w:val="false"/>
+          <w:color w:val="2E7D32"/>
+          <w:sz w:val="24"/>
+          <w:szCs w:val="24"/>
+        </w:rPr>
+        <w:t xml:space="preserve">Définition — </w:t>
+      </w:r>
+      <w:r>
+        <w:rPr>
+          <w:rFonts w:ascii="Times New Roman" w:cs="Times New Roman" w:eastAsia="Times New Roman" w:hAnsi="Times New Roman"/>
+          <w:b/>
+          <w:bCs/>
+          <w:i w:val="false"/>
+          <w:iCs w:val="false"/>
+          <w:color w:val="000000"/>
+          <w:sz w:val="24"/>
+          <w:szCs w:val="24"/>
+        </w:rPr>
+        <w:t xml:space="preserve">Deux fractions sont équivalentes lorsqu’elles représentent la même part d’un même tout. On obtient une fraction équivalente en multipliant ou en divisant le numérateur et le dénominateur par un même nombre non nul.</w:t>
+      </w:r>
+    </w:p>
+    <w:p>
+      <w:pPr>
+        <w:spacing w:after="110" w:line="300"/>
+        <w:jc w:val="both"/>
+      </w:pPr>
+      <w:r>
+        <w:rPr>
+          <w:rFonts w:ascii="Times New Roman" w:cs="Times New Roman" w:eastAsia="Times New Roman" w:hAnsi="Times New Roman"/>
+          <w:b/>
+          <w:bCs/>
+          <w:i w:val="false"/>
+          <w:iCs w:val="false"/>
+          <w:color w:val="1F4E79"/>
+          <w:sz w:val="24"/>
+          <w:szCs w:val="24"/>
+        </w:rPr>
+        <w:t xml:space="preserve">Autrement dit : </w:t>
+      </w:r>
+      <w:r>
+        <w:rPr>
+          <w:rFonts w:ascii="Times New Roman" w:cs="Times New Roman" w:eastAsia="Times New Roman" w:hAnsi="Times New Roman"/>
+          <w:b w:val="false"/>
+          <w:bCs w:val="false"/>
+          <w:i w:val="false"/>
+          <w:iCs w:val="false"/>
+          <w:color w:val="000000"/>
+          <w:sz w:val="24"/>
+          <w:szCs w:val="24"/>
+        </w:rPr>
+        <w:t xml:space="preserve">couper chaque part en deux ne change pas la quantité mangée : </w:t>
+      </w:r>
+      <m:oMath>
+        <m:f>
+          <m:num>
+            <m:r>
+              <m:t>2</m:t>
+            </m:r>
+          </m:num>
+          <m:den>
+            <m:r>
+              <m:t>3</m:t>
+            </m:r>
+          </m:den>
+        </m:f>
+      </m:oMath>
+      <w:r>
+        <w:rPr>
+          <w:rFonts w:ascii="Times New Roman" w:cs="Times New Roman" w:eastAsia="Times New Roman" w:hAnsi="Times New Roman"/>
+          <w:b w:val="false"/>
+          <w:bCs w:val="false"/>
+          <w:i w:val="false"/>
+          <w:iCs w:val="false"/>
+          <w:color w:val="000000"/>
+          <w:sz w:val="24"/>
+          <w:szCs w:val="24"/>
+        </w:rPr>
+        <w:t xml:space="preserve">et </w:t>
+      </w:r>
+      <m:oMath>
+        <m:f>
+          <m:num>
+            <m:r>
+              <m:t>4</m:t>
+            </m:r>
+          </m:num>
+          <m:den>
+            <m:r>
+              <m:t>6</m:t>
+            </m:r>
+          </m:den>
+        </m:f>
+      </m:oMath>
+      <w:r>
+        <w:rPr>
+          <w:rFonts w:ascii="Times New Roman" w:cs="Times New Roman" w:eastAsia="Times New Roman" w:hAnsi="Times New Roman"/>
+          <w:b w:val="false"/>
+          <w:bCs w:val="false"/>
+          <w:i w:val="false"/>
+          <w:iCs w:val="false"/>
+          <w:color w:val="000000"/>
+          <w:sz w:val="24"/>
+          <w:szCs w:val="24"/>
+        </w:rPr>
+        <w:t xml:space="preserve">, c’est pareil.</w:t>
+      </w:r>
+    </w:p>
+    <w:p>
+      <w:pPr>
+        <w:spacing w:after="110" w:line="300"/>
+        <w:jc w:val="both"/>
+      </w:pPr>
+      <w:r>
+        <w:rPr>
+          <w:rFonts w:ascii="Times New Roman" w:cs="Times New Roman" w:eastAsia="Times New Roman" w:hAnsi="Times New Roman"/>
+          <w:b w:val="false"/>
+          <w:bCs w:val="false"/>
+          <w:i w:val="false"/>
+          <w:iCs w:val="false"/>
+          <w:color w:val="000000"/>
+          <w:sz w:val="24"/>
+          <w:szCs w:val="24"/>
+        </w:rPr>
+        <w:t xml:space="preserve">Sur les bandes fractionnées, </w:t>
+      </w:r>
+      <m:oMath>
+        <m:f>
+          <m:num>
+            <m:r>
+              <m:t>2</m:t>
+            </m:r>
+          </m:num>
+          <m:den>
+            <m:r>
+              <m:t>3</m:t>
+            </m:r>
+          </m:den>
+        </m:f>
+      </m:oMath>
+      <w:r>
+        <w:rPr>
+          <w:rFonts w:ascii="Times New Roman" w:cs="Times New Roman" w:eastAsia="Times New Roman" w:hAnsi="Times New Roman"/>
+          <w:b w:val="false"/>
+          <w:bCs w:val="false"/>
+          <w:i w:val="false"/>
+          <w:iCs w:val="false"/>
+          <w:color w:val="000000"/>
+          <w:sz w:val="24"/>
+          <w:szCs w:val="24"/>
+        </w:rPr>
+        <w:t xml:space="preserve">, </w:t>
+      </w:r>
+      <m:oMath>
+        <m:f>
+          <m:num>
+            <m:r>
+              <m:t>4</m:t>
+            </m:r>
+          </m:num>
+          <m:den>
+            <m:r>
+              <m:t>6</m:t>
+            </m:r>
+          </m:den>
+        </m:f>
+      </m:oMath>
+      <w:r>
+        <w:rPr>
+          <w:rFonts w:ascii="Times New Roman" w:cs="Times New Roman" w:eastAsia="Times New Roman" w:hAnsi="Times New Roman"/>
+          <w:b w:val="false"/>
+          <w:bCs w:val="false"/>
+          <w:i w:val="false"/>
+          <w:iCs w:val="false"/>
+          <w:color w:val="000000"/>
+          <w:sz w:val="24"/>
+          <w:szCs w:val="24"/>
+        </w:rPr>
+        <w:t xml:space="preserve">et </w:t>
+      </w:r>
+      <m:oMath>
+        <m:f>
+          <m:num>
+            <m:r>
+              <m:t>8</m:t>
+            </m:r>
+          </m:num>
+          <m:den>
+            <m:r>
+              <m:t>12</m:t>
+            </m:r>
+          </m:den>
+        </m:f>
+      </m:oMath>
+      <w:r>
+        <w:rPr>
+          <w:rFonts w:ascii="Times New Roman" w:cs="Times New Roman" w:eastAsia="Times New Roman" w:hAnsi="Times New Roman"/>
+          <w:b w:val="false"/>
+          <w:bCs w:val="false"/>
+          <w:i w:val="false"/>
+          <w:iCs w:val="false"/>
+          <w:color w:val="000000"/>
+          <w:sz w:val="24"/>
+          <w:szCs w:val="24"/>
+        </w:rPr>
+        <w:t xml:space="preserve">colorient exactement la même longueur : ces fractions sont équivalentes. En calcul, on passe de </w:t>
+      </w:r>
+      <m:oMath>
+        <m:f>
+          <m:num>
+            <m:r>
+              <m:t>2</m:t>
+            </m:r>
+          </m:num>
+          <m:den>
+            <m:r>
+              <m:t>3</m:t>
+            </m:r>
+          </m:den>
+        </m:f>
+      </m:oMath>
+      <w:r>
+        <w:rPr>
+          <w:rFonts w:ascii="Times New Roman" w:cs="Times New Roman" w:eastAsia="Times New Roman" w:hAnsi="Times New Roman"/>
+          <w:b w:val="false"/>
+          <w:bCs w:val="false"/>
+          <w:i w:val="false"/>
+          <w:iCs w:val="false"/>
+          <w:color w:val="000000"/>
+          <w:sz w:val="24"/>
+          <w:szCs w:val="24"/>
+        </w:rPr>
+        <w:t xml:space="preserve">à </w:t>
+      </w:r>
+      <m:oMath>
+        <m:f>
+          <m:num>
+            <m:r>
+              <m:t>4</m:t>
+            </m:r>
+          </m:num>
+          <m:den>
+            <m:r>
+              <m:t>6</m:t>
+            </m:r>
+          </m:den>
+        </m:f>
+      </m:oMath>
+      <w:r>
+        <w:rPr>
+          <w:rFonts w:ascii="Times New Roman" w:cs="Times New Roman" w:eastAsia="Times New Roman" w:hAnsi="Times New Roman"/>
+          <w:b w:val="false"/>
+          <w:bCs w:val="false"/>
+          <w:i w:val="false"/>
+          <w:iCs w:val="false"/>
+          <w:color w:val="000000"/>
+          <w:sz w:val="24"/>
+          <w:szCs w:val="24"/>
+        </w:rPr>
+        <w:t xml:space="preserve">en multipliant le numérateur et le dénominateur par 2, et de </w:t>
+      </w:r>
+      <m:oMath>
+        <m:f>
+          <m:num>
+            <m:r>
+              <m:t>4</m:t>
+            </m:r>
+          </m:num>
+          <m:den>
+            <m:r>
+              <m:t>6</m:t>
+            </m:r>
+          </m:den>
+        </m:f>
+      </m:oMath>
+      <w:r>
+        <w:rPr>
+          <w:rFonts w:ascii="Times New Roman" w:cs="Times New Roman" w:eastAsia="Times New Roman" w:hAnsi="Times New Roman"/>
+          <w:b w:val="false"/>
+          <w:bCs w:val="false"/>
+          <w:i w:val="false"/>
+          <w:iCs w:val="false"/>
+          <w:color w:val="000000"/>
+          <w:sz w:val="24"/>
+          <w:szCs w:val="24"/>
+        </w:rPr>
+        <w:t xml:space="preserve">à </w:t>
+      </w:r>
+      <m:oMath>
+        <m:f>
+          <m:num>
+            <m:r>
+              <m:t>8</m:t>
+            </m:r>
+          </m:num>
+          <m:den>
+            <m:r>
+              <m:t>12</m:t>
+            </m:r>
+          </m:den>
+        </m:f>
+      </m:oMath>
+      <w:r>
+        <w:rPr>
+          <w:rFonts w:ascii="Times New Roman" w:cs="Times New Roman" w:eastAsia="Times New Roman" w:hAnsi="Times New Roman"/>
+          <w:b w:val="false"/>
+          <w:bCs w:val="false"/>
+          <w:i w:val="false"/>
+          <w:iCs w:val="false"/>
+          <w:color w:val="000000"/>
+          <w:sz w:val="24"/>
+          <w:szCs w:val="24"/>
+        </w:rPr>
+        <w:t xml:space="preserve">en les multipliant encore par 2.</w:t>
+      </w:r>
+    </w:p>
+    <w:p>
+      <w:pPr>
+        <w:spacing w:after="120" w:before="120"/>
+        <w:jc w:val="center"/>
+      </w:pPr>
+      <w:r>
+        <w:drawing>
+          <wp:inline distT="0" distB="0" distL="0" distR="0">
+            <wp:extent cx="4762500" cy="2019300"/>
+            <wp:effectExtent t="0" r="0" b="0" l="0"/>
+            <wp:docPr id="9" name="" descr="" title=""/>
+            <wp:cNvGraphicFramePr>
+              <a:graphicFrameLocks xmlns:a="http://schemas.openxmlformats.org/drawingml/2006/main" noChangeAspect="1"/>
+            </wp:cNvGraphicFramePr>
+            <a:graphic xmlns:a="http://schemas.openxmlformats.org/drawingml/2006/main">
+              <a:graphicData uri="http://schemas.openxmlformats.org/drawingml/2006/picture">
+                <pic:pic xmlns:pic="http://schemas.openxmlformats.org/drawingml/2006/picture">
+                  <pic:nvPicPr>
+                    <pic:cNvPr id="0" name="" descr=""/>
+                    <pic:cNvPicPr>
+                      <a:picLocks noChangeAspect="1" noChangeArrowheads="1"/>
+                    </pic:cNvPicPr>
+                  </pic:nvPicPr>
+                  <pic:blipFill>
+                    <a:blip r:embed="rId17" cstate="none"/>
                     <a:srcRect/>
                     <a:stretch>
                       <a:fillRect/>
@@ -20686,206 +20870,15 @@
     </w:p>
     <w:p>
       <w:pPr>
-        <w:spacing w:after="110" w:line="300"/>
-        <w:jc w:val="both"/>
-      </w:pPr>
-      <w:r>
-        <w:rPr>
-          <w:rFonts w:ascii="Times New Roman" w:cs="Times New Roman" w:eastAsia="Times New Roman" w:hAnsi="Times New Roman"/>
-          <w:b/>
-          <w:bCs/>
-          <w:i w:val="false"/>
-          <w:iCs w:val="false"/>
-          <w:color w:val="2E7D32"/>
-          <w:sz w:val="24"/>
-          <w:szCs w:val="24"/>
-        </w:rPr>
-        <w:t xml:space="preserve">Définition — </w:t>
-      </w:r>
-      <w:r>
-        <w:rPr>
-          <w:rFonts w:ascii="Times New Roman" w:cs="Times New Roman" w:eastAsia="Times New Roman" w:hAnsi="Times New Roman"/>
-          <w:b/>
-          <w:bCs/>
-          <w:i w:val="false"/>
-          <w:iCs w:val="false"/>
-          <w:color w:val="000000"/>
-          <w:sz w:val="24"/>
-          <w:szCs w:val="24"/>
-        </w:rPr>
-        <w:t xml:space="preserve">Simplifier une fraction, c’est la remplacer par une fraction équivalente dont le numérateur et le dénominateur sont plus petits, en les divisant par un même diviseur commun.</w:t>
-      </w:r>
-    </w:p>
-    <w:p>
-      <w:pPr>
-        <w:spacing w:after="110" w:line="300"/>
-        <w:jc w:val="both"/>
-      </w:pPr>
-      <w:r>
-        <w:rPr>
-          <w:rFonts w:ascii="Times New Roman" w:cs="Times New Roman" w:eastAsia="Times New Roman" w:hAnsi="Times New Roman"/>
-          <w:b/>
-          <w:bCs/>
-          <w:i w:val="false"/>
-          <w:iCs w:val="false"/>
-          <w:color w:val="1F4E79"/>
-          <w:sz w:val="24"/>
-          <w:szCs w:val="24"/>
-        </w:rPr>
-        <w:t xml:space="preserve">Autrement dit : </w:t>
-      </w:r>
-      <w:r>
-        <w:rPr>
-          <w:rFonts w:ascii="Times New Roman" w:cs="Times New Roman" w:eastAsia="Times New Roman" w:hAnsi="Times New Roman"/>
-          <w:b w:val="false"/>
-          <w:bCs w:val="false"/>
-          <w:i w:val="false"/>
-          <w:iCs w:val="false"/>
-          <w:color w:val="000000"/>
-          <w:sz w:val="24"/>
-          <w:szCs w:val="24"/>
-        </w:rPr>
-        <w:t xml:space="preserve">on « réduit » la fraction sans changer sa valeur : </w:t>
-      </w:r>
-      <m:oMath>
-        <m:f>
-          <m:num>
-            <m:r>
-              <m:t>12</m:t>
-            </m:r>
-          </m:num>
-          <m:den>
-            <m:r>
-              <m:t>18</m:t>
-            </m:r>
-          </m:den>
-        </m:f>
-      </m:oMath>
-      <w:r>
-        <w:rPr>
-          <w:rFonts w:ascii="Times New Roman" w:cs="Times New Roman" w:eastAsia="Times New Roman" w:hAnsi="Times New Roman"/>
-          <w:b w:val="false"/>
-          <w:bCs w:val="false"/>
-          <w:i w:val="false"/>
-          <w:iCs w:val="false"/>
-          <w:color w:val="000000"/>
-          <w:sz w:val="24"/>
-          <w:szCs w:val="24"/>
-        </w:rPr>
-        <w:t xml:space="preserve">et </w:t>
-      </w:r>
-      <m:oMath>
-        <m:f>
-          <m:num>
-            <m:r>
-              <m:t>2</m:t>
-            </m:r>
-          </m:num>
-          <m:den>
-            <m:r>
-              <m:t>3</m:t>
-            </m:r>
-          </m:den>
-        </m:f>
-      </m:oMath>
-      <w:r>
-        <w:rPr>
-          <w:rFonts w:ascii="Times New Roman" w:cs="Times New Roman" w:eastAsia="Times New Roman" w:hAnsi="Times New Roman"/>
-          <w:b w:val="false"/>
-          <w:bCs w:val="false"/>
-          <w:i w:val="false"/>
-          <w:iCs w:val="false"/>
-          <w:color w:val="000000"/>
-          <w:sz w:val="24"/>
-          <w:szCs w:val="24"/>
-        </w:rPr>
-        <w:t xml:space="preserve">représentent la même part.</w:t>
-      </w:r>
-    </w:p>
-    <w:p>
-      <w:pPr>
-        <w:spacing w:after="110" w:line="300"/>
-        <w:jc w:val="both"/>
-      </w:pPr>
-      <w:r>
-        <w:rPr>
-          <w:rFonts w:ascii="Times New Roman" w:cs="Times New Roman" w:eastAsia="Times New Roman" w:hAnsi="Times New Roman"/>
-          <w:b w:val="false"/>
-          <w:bCs w:val="false"/>
-          <w:i w:val="false"/>
-          <w:iCs w:val="false"/>
-          <w:color w:val="000000"/>
-          <w:sz w:val="24"/>
-          <w:szCs w:val="24"/>
-        </w:rPr>
-        <w:t xml:space="preserve">Pour simplifier, on cherche un diviseur commun au numérateur et au dénominateur. 12 et 18 sont tous deux divisibles par 6 : 12 ÷ 6 = 2 et 18 ÷ 6 = 3, donc </w:t>
-      </w:r>
-      <m:oMath>
-        <m:f>
-          <m:num>
-            <m:r>
-              <m:t>12</m:t>
-            </m:r>
-          </m:num>
-          <m:den>
-            <m:r>
-              <m:t>18</m:t>
-            </m:r>
-          </m:den>
-        </m:f>
-      </m:oMath>
-      <w:r>
-        <w:rPr>
-          <w:rFonts w:ascii="Times New Roman" w:cs="Times New Roman" w:eastAsia="Times New Roman" w:hAnsi="Times New Roman"/>
-          <w:b w:val="false"/>
-          <w:bCs w:val="false"/>
-          <w:i w:val="false"/>
-          <w:iCs w:val="false"/>
-          <w:color w:val="000000"/>
-          <w:sz w:val="24"/>
-          <w:szCs w:val="24"/>
-        </w:rPr>
-        <w:t xml:space="preserve">= </w:t>
-      </w:r>
-      <m:oMath>
-        <m:f>
-          <m:num>
-            <m:r>
-              <m:t>2</m:t>
-            </m:r>
-          </m:num>
-          <m:den>
-            <m:r>
-              <m:t>3</m:t>
-            </m:r>
-          </m:den>
-        </m:f>
-      </m:oMath>
-      <w:r>
-        <w:rPr>
-          <w:rFonts w:ascii="Times New Roman" w:cs="Times New Roman" w:eastAsia="Times New Roman" w:hAnsi="Times New Roman"/>
-          <w:b w:val="false"/>
-          <w:bCs w:val="false"/>
-          <w:i w:val="false"/>
-          <w:iCs w:val="false"/>
-          <w:color w:val="000000"/>
-          <w:sz w:val="24"/>
-          <w:szCs w:val="24"/>
-        </w:rPr>
-        <w:t xml:space="preserve">. On peut aussi simplifier en plusieurs étapes : d’abord par 2, puis par 3.</w:t>
-      </w:r>
-    </w:p>
-    <w:p>
-      <w:pPr>
         <w:spacing w:after="120" w:before="120"/>
         <w:jc w:val="center"/>
       </w:pPr>
       <w:r>
         <w:drawing>
           <wp:inline distT="0" distB="0" distL="0" distR="0">
-            <wp:extent cx="4762500" cy="1447800"/>
+            <wp:extent cx="4095750" cy="2286000"/>
             <wp:effectExtent t="0" r="0" b="0" l="0"/>
-            <wp:docPr id="6" name="" descr="" title=""/>
+            <wp:docPr id="10" name="" descr="" title=""/>
             <wp:cNvGraphicFramePr>
               <a:graphicFrameLocks xmlns:a="http://schemas.openxmlformats.org/drawingml/2006/main" noChangeAspect="1"/>
             </wp:cNvGraphicFramePr>
@@ -20899,7 +20892,244 @@
                     </pic:cNvPicPr>
                   </pic:nvPicPr>
                   <pic:blipFill>
-                    <a:blip r:embed="rId14" cstate="none"/>
+                    <a:blip r:embed="rId18" cstate="none"/>
+                    <a:srcRect/>
+                    <a:stretch>
+                      <a:fillRect/>
+                    </a:stretch>
+                  </pic:blipFill>
+                  <pic:spPr bwMode="auto">
+                    <a:xfrm>
+                      <a:off x="0" y="0"/>
+                      <a:ext cx="4095750" cy="2286000"/>
+                    </a:xfrm>
+                    <a:prstGeom prst="rect">
+                      <a:avLst/>
+                    </a:prstGeom>
+                  </pic:spPr>
+                </pic:pic>
+              </a:graphicData>
+            </a:graphic>
+          </wp:inline>
+        </w:drawing>
+      </w:r>
+    </w:p>
+    <w:p>
+      <w:pPr>
+        <w:spacing w:after="110" w:line="300"/>
+        <w:jc w:val="both"/>
+      </w:pPr>
+      <w:r>
+        <w:rPr>
+          <w:rFonts w:ascii="Times New Roman" w:cs="Times New Roman" w:eastAsia="Times New Roman" w:hAnsi="Times New Roman"/>
+          <w:b/>
+          <w:bCs/>
+          <w:i w:val="false"/>
+          <w:iCs w:val="false"/>
+          <w:color w:val="2E7D32"/>
+          <w:sz w:val="24"/>
+          <w:szCs w:val="24"/>
+        </w:rPr>
+        <w:t xml:space="preserve">Définition — </w:t>
+      </w:r>
+      <w:r>
+        <w:rPr>
+          <w:rFonts w:ascii="Times New Roman" w:cs="Times New Roman" w:eastAsia="Times New Roman" w:hAnsi="Times New Roman"/>
+          <w:b/>
+          <w:bCs/>
+          <w:i w:val="false"/>
+          <w:iCs w:val="false"/>
+          <w:color w:val="000000"/>
+          <w:sz w:val="24"/>
+          <w:szCs w:val="24"/>
+        </w:rPr>
+        <w:t xml:space="preserve">Simplifier une fraction, c’est la remplacer par une fraction équivalente dont le numérateur et le dénominateur sont plus petits, en les divisant par un même diviseur commun.</w:t>
+      </w:r>
+    </w:p>
+    <w:p>
+      <w:pPr>
+        <w:spacing w:after="110" w:line="300"/>
+        <w:jc w:val="both"/>
+      </w:pPr>
+      <w:r>
+        <w:rPr>
+          <w:rFonts w:ascii="Times New Roman" w:cs="Times New Roman" w:eastAsia="Times New Roman" w:hAnsi="Times New Roman"/>
+          <w:b/>
+          <w:bCs/>
+          <w:i w:val="false"/>
+          <w:iCs w:val="false"/>
+          <w:color w:val="1F4E79"/>
+          <w:sz w:val="24"/>
+          <w:szCs w:val="24"/>
+        </w:rPr>
+        <w:t xml:space="preserve">Autrement dit : </w:t>
+      </w:r>
+      <w:r>
+        <w:rPr>
+          <w:rFonts w:ascii="Times New Roman" w:cs="Times New Roman" w:eastAsia="Times New Roman" w:hAnsi="Times New Roman"/>
+          <w:b w:val="false"/>
+          <w:bCs w:val="false"/>
+          <w:i w:val="false"/>
+          <w:iCs w:val="false"/>
+          <w:color w:val="000000"/>
+          <w:sz w:val="24"/>
+          <w:szCs w:val="24"/>
+        </w:rPr>
+        <w:t xml:space="preserve">on « réduit » la fraction sans changer sa valeur : </w:t>
+      </w:r>
+      <m:oMath>
+        <m:f>
+          <m:num>
+            <m:r>
+              <m:t>12</m:t>
+            </m:r>
+          </m:num>
+          <m:den>
+            <m:r>
+              <m:t>18</m:t>
+            </m:r>
+          </m:den>
+        </m:f>
+      </m:oMath>
+      <w:r>
+        <w:rPr>
+          <w:rFonts w:ascii="Times New Roman" w:cs="Times New Roman" w:eastAsia="Times New Roman" w:hAnsi="Times New Roman"/>
+          <w:b w:val="false"/>
+          <w:bCs w:val="false"/>
+          <w:i w:val="false"/>
+          <w:iCs w:val="false"/>
+          <w:color w:val="000000"/>
+          <w:sz w:val="24"/>
+          <w:szCs w:val="24"/>
+        </w:rPr>
+        <w:t xml:space="preserve">et </w:t>
+      </w:r>
+      <m:oMath>
+        <m:f>
+          <m:num>
+            <m:r>
+              <m:t>2</m:t>
+            </m:r>
+          </m:num>
+          <m:den>
+            <m:r>
+              <m:t>3</m:t>
+            </m:r>
+          </m:den>
+        </m:f>
+      </m:oMath>
+      <w:r>
+        <w:rPr>
+          <w:rFonts w:ascii="Times New Roman" w:cs="Times New Roman" w:eastAsia="Times New Roman" w:hAnsi="Times New Roman"/>
+          <w:b w:val="false"/>
+          <w:bCs w:val="false"/>
+          <w:i w:val="false"/>
+          <w:iCs w:val="false"/>
+          <w:color w:val="000000"/>
+          <w:sz w:val="24"/>
+          <w:szCs w:val="24"/>
+        </w:rPr>
+        <w:t xml:space="preserve">représentent la même part.</w:t>
+      </w:r>
+    </w:p>
+    <w:p>
+      <w:pPr>
+        <w:spacing w:after="110" w:line="300"/>
+        <w:jc w:val="both"/>
+      </w:pPr>
+      <w:r>
+        <w:rPr>
+          <w:rFonts w:ascii="Times New Roman" w:cs="Times New Roman" w:eastAsia="Times New Roman" w:hAnsi="Times New Roman"/>
+          <w:b w:val="false"/>
+          <w:bCs w:val="false"/>
+          <w:i w:val="false"/>
+          <w:iCs w:val="false"/>
+          <w:color w:val="000000"/>
+          <w:sz w:val="24"/>
+          <w:szCs w:val="24"/>
+        </w:rPr>
+        <w:t xml:space="preserve">Pour simplifier, on cherche un diviseur commun au numérateur et au dénominateur. 12 et 18 sont tous deux divisibles par 6 : 12 ÷ 6 = 2 et 18 ÷ 6 = 3, donc </w:t>
+      </w:r>
+      <m:oMath>
+        <m:f>
+          <m:num>
+            <m:r>
+              <m:t>12</m:t>
+            </m:r>
+          </m:num>
+          <m:den>
+            <m:r>
+              <m:t>18</m:t>
+            </m:r>
+          </m:den>
+        </m:f>
+      </m:oMath>
+      <w:r>
+        <w:rPr>
+          <w:rFonts w:ascii="Times New Roman" w:cs="Times New Roman" w:eastAsia="Times New Roman" w:hAnsi="Times New Roman"/>
+          <w:b w:val="false"/>
+          <w:bCs w:val="false"/>
+          <w:i w:val="false"/>
+          <w:iCs w:val="false"/>
+          <w:color w:val="000000"/>
+          <w:sz w:val="24"/>
+          <w:szCs w:val="24"/>
+        </w:rPr>
+        <w:t xml:space="preserve">= </w:t>
+      </w:r>
+      <m:oMath>
+        <m:f>
+          <m:num>
+            <m:r>
+              <m:t>2</m:t>
+            </m:r>
+          </m:num>
+          <m:den>
+            <m:r>
+              <m:t>3</m:t>
+            </m:r>
+          </m:den>
+        </m:f>
+      </m:oMath>
+      <w:r>
+        <w:rPr>
+          <w:rFonts w:ascii="Times New Roman" w:cs="Times New Roman" w:eastAsia="Times New Roman" w:hAnsi="Times New Roman"/>
+          <w:b w:val="false"/>
+          <w:bCs w:val="false"/>
+          <w:i w:val="false"/>
+          <w:iCs w:val="false"/>
+          <w:color w:val="000000"/>
+          <w:sz w:val="24"/>
+          <w:szCs w:val="24"/>
+        </w:rPr>
+        <w:t xml:space="preserve">. On peut aussi simplifier en plusieurs étapes : d’abord par 2, puis par 3.</w:t>
+      </w:r>
+    </w:p>
+    <w:p>
+      <w:pPr>
+        <w:spacing w:after="120" w:before="120"/>
+        <w:jc w:val="center"/>
+      </w:pPr>
+      <w:r>
+        <w:drawing>
+          <wp:inline distT="0" distB="0" distL="0" distR="0">
+            <wp:extent cx="4762500" cy="1447800"/>
+            <wp:effectExtent t="0" r="0" b="0" l="0"/>
+            <wp:docPr id="11" name="" descr="" title=""/>
+            <wp:cNvGraphicFramePr>
+              <a:graphicFrameLocks xmlns:a="http://schemas.openxmlformats.org/drawingml/2006/main" noChangeAspect="1"/>
+            </wp:cNvGraphicFramePr>
+            <a:graphic xmlns:a="http://schemas.openxmlformats.org/drawingml/2006/main">
+              <a:graphicData uri="http://schemas.openxmlformats.org/drawingml/2006/picture">
+                <pic:pic xmlns:pic="http://schemas.openxmlformats.org/drawingml/2006/picture">
+                  <pic:nvPicPr>
+                    <pic:cNvPr id="0" name="" descr=""/>
+                    <pic:cNvPicPr>
+                      <a:picLocks noChangeAspect="1" noChangeArrowheads="1"/>
+                    </pic:cNvPicPr>
+                  </pic:nvPicPr>
+                  <pic:blipFill>
+                    <a:blip r:embed="rId19" cstate="none"/>
                     <a:srcRect/>
                     <a:stretch>
                       <a:fillRect/>
@@ -25170,206 +25400,15 @@
     </w:p>
     <w:p>
       <w:pPr>
-        <w:spacing w:after="110" w:line="300"/>
-        <w:jc w:val="both"/>
-      </w:pPr>
-      <w:r>
-        <w:rPr>
-          <w:rFonts w:ascii="Times New Roman" w:cs="Times New Roman" w:eastAsia="Times New Roman" w:hAnsi="Times New Roman"/>
-          <w:b/>
-          <w:bCs/>
-          <w:i w:val="false"/>
-          <w:iCs w:val="false"/>
-          <w:color w:val="2E7D32"/>
-          <w:sz w:val="24"/>
-          <w:szCs w:val="24"/>
-        </w:rPr>
-        <w:t xml:space="preserve">Définition — </w:t>
-      </w:r>
-      <w:r>
-        <w:rPr>
-          <w:rFonts w:ascii="Times New Roman" w:cs="Times New Roman" w:eastAsia="Times New Roman" w:hAnsi="Times New Roman"/>
-          <w:b/>
-          <w:bCs/>
-          <w:i w:val="false"/>
-          <w:iCs w:val="false"/>
-          <w:color w:val="000000"/>
-          <w:sz w:val="24"/>
-          <w:szCs w:val="24"/>
-        </w:rPr>
-        <w:t xml:space="preserve">Une fraction est irréductible lorsque son numérateur et son dénominateur n’ont aucun diviseur commun autre que 1.</w:t>
-      </w:r>
-    </w:p>
-    <w:p>
-      <w:pPr>
-        <w:spacing w:after="110" w:line="300"/>
-        <w:jc w:val="both"/>
-      </w:pPr>
-      <w:r>
-        <w:rPr>
-          <w:rFonts w:ascii="Times New Roman" w:cs="Times New Roman" w:eastAsia="Times New Roman" w:hAnsi="Times New Roman"/>
-          <w:b/>
-          <w:bCs/>
-          <w:i w:val="false"/>
-          <w:iCs w:val="false"/>
-          <w:color w:val="1F4E79"/>
-          <w:sz w:val="24"/>
-          <w:szCs w:val="24"/>
-        </w:rPr>
-        <w:t xml:space="preserve">Autrement dit : </w:t>
-      </w:r>
-      <w:r>
-        <w:rPr>
-          <w:rFonts w:ascii="Times New Roman" w:cs="Times New Roman" w:eastAsia="Times New Roman" w:hAnsi="Times New Roman"/>
-          <w:b w:val="false"/>
-          <w:bCs w:val="false"/>
-          <w:i w:val="false"/>
-          <w:iCs w:val="false"/>
-          <w:color w:val="000000"/>
-          <w:sz w:val="24"/>
-          <w:szCs w:val="24"/>
-        </w:rPr>
-        <w:t xml:space="preserve">c’est la fraction « la plus simple possible » : on ne peut plus la réduire.</w:t>
-      </w:r>
-    </w:p>
-    <w:p>
-      <w:pPr>
-        <w:spacing w:after="110" w:line="300"/>
-        <w:jc w:val="both"/>
-      </w:pPr>
-      <w:r>
-        <w:rPr>
-          <w:rFonts w:ascii="Times New Roman" w:cs="Times New Roman" w:eastAsia="Times New Roman" w:hAnsi="Times New Roman"/>
-          <w:b w:val="false"/>
-          <w:bCs w:val="false"/>
-          <w:i w:val="false"/>
-          <w:iCs w:val="false"/>
-          <w:color w:val="000000"/>
-          <w:sz w:val="24"/>
-          <w:szCs w:val="24"/>
-        </w:rPr>
-        <w:t xml:space="preserve">Pour trouver la forme irréductible, on simplifie autant de fois que nécessaire : </w:t>
-      </w:r>
-      <m:oMath>
-        <m:f>
-          <m:num>
-            <m:r>
-              <m:t>24</m:t>
-            </m:r>
-          </m:num>
-          <m:den>
-            <m:r>
-              <m:t>36</m:t>
-            </m:r>
-          </m:den>
-        </m:f>
-      </m:oMath>
-      <w:r>
-        <w:rPr>
-          <w:rFonts w:ascii="Times New Roman" w:cs="Times New Roman" w:eastAsia="Times New Roman" w:hAnsi="Times New Roman"/>
-          <w:b w:val="false"/>
-          <w:bCs w:val="false"/>
-          <w:i w:val="false"/>
-          <w:iCs w:val="false"/>
-          <w:color w:val="000000"/>
-          <w:sz w:val="24"/>
-          <w:szCs w:val="24"/>
-        </w:rPr>
-        <w:t xml:space="preserve">= </w:t>
-      </w:r>
-      <m:oMath>
-        <m:f>
-          <m:num>
-            <m:r>
-              <m:t>12</m:t>
-            </m:r>
-          </m:num>
-          <m:den>
-            <m:r>
-              <m:t>18</m:t>
-            </m:r>
-          </m:den>
-        </m:f>
-      </m:oMath>
-      <w:r>
-        <w:rPr>
-          <w:rFonts w:ascii="Times New Roman" w:cs="Times New Roman" w:eastAsia="Times New Roman" w:hAnsi="Times New Roman"/>
-          <w:b w:val="false"/>
-          <w:bCs w:val="false"/>
-          <w:i w:val="false"/>
-          <w:iCs w:val="false"/>
-          <w:color w:val="000000"/>
-          <w:sz w:val="24"/>
-          <w:szCs w:val="24"/>
-        </w:rPr>
-        <w:t xml:space="preserve">(÷ 2) = </w:t>
-      </w:r>
-      <m:oMath>
-        <m:f>
-          <m:num>
-            <m:r>
-              <m:t>2</m:t>
-            </m:r>
-          </m:num>
-          <m:den>
-            <m:r>
-              <m:t>3</m:t>
-            </m:r>
-          </m:den>
-        </m:f>
-      </m:oMath>
-      <w:r>
-        <w:rPr>
-          <w:rFonts w:ascii="Times New Roman" w:cs="Times New Roman" w:eastAsia="Times New Roman" w:hAnsi="Times New Roman"/>
-          <w:b w:val="false"/>
-          <w:bCs w:val="false"/>
-          <w:i w:val="false"/>
-          <w:iCs w:val="false"/>
-          <w:color w:val="000000"/>
-          <w:sz w:val="24"/>
-          <w:szCs w:val="24"/>
-        </w:rPr>
-        <w:t xml:space="preserve">(÷ 6). On s’arrête quand 1 est le seul diviseur commun du haut et du bas : 2 et 3 n’ont pas de diviseur commun, donc </w:t>
-      </w:r>
-      <m:oMath>
-        <m:f>
-          <m:num>
-            <m:r>
-              <m:t>2</m:t>
-            </m:r>
-          </m:num>
-          <m:den>
-            <m:r>
-              <m:t>3</m:t>
-            </m:r>
-          </m:den>
-        </m:f>
-      </m:oMath>
-      <w:r>
-        <w:rPr>
-          <w:rFonts w:ascii="Times New Roman" w:cs="Times New Roman" w:eastAsia="Times New Roman" w:hAnsi="Times New Roman"/>
-          <w:b w:val="false"/>
-          <w:bCs w:val="false"/>
-          <w:i w:val="false"/>
-          <w:iCs w:val="false"/>
-          <w:color w:val="000000"/>
-          <w:sz w:val="24"/>
-          <w:szCs w:val="24"/>
-        </w:rPr>
-        <w:t xml:space="preserve">est irréductible. Diviser directement par le plus grand diviseur commun (ici 12) va plus vite.</w:t>
-      </w:r>
-    </w:p>
-    <w:p>
-      <w:pPr>
         <w:spacing w:after="120" w:before="120"/>
         <w:jc w:val="center"/>
       </w:pPr>
       <w:r>
         <w:drawing>
           <wp:inline distT="0" distB="0" distL="0" distR="0">
-            <wp:extent cx="4762500" cy="1552575"/>
+            <wp:extent cx="4095750" cy="2286000"/>
             <wp:effectExtent t="0" r="0" b="0" l="0"/>
-            <wp:docPr id="7" name="" descr="" title=""/>
+            <wp:docPr id="12" name="" descr="" title=""/>
             <wp:cNvGraphicFramePr>
               <a:graphicFrameLocks xmlns:a="http://schemas.openxmlformats.org/drawingml/2006/main" noChangeAspect="1"/>
             </wp:cNvGraphicFramePr>
@@ -25383,7 +25422,244 @@
                     </pic:cNvPicPr>
                   </pic:nvPicPr>
                   <pic:blipFill>
-                    <a:blip r:embed="rId15" cstate="none"/>
+                    <a:blip r:embed="rId20" cstate="none"/>
+                    <a:srcRect/>
+                    <a:stretch>
+                      <a:fillRect/>
+                    </a:stretch>
+                  </pic:blipFill>
+                  <pic:spPr bwMode="auto">
+                    <a:xfrm>
+                      <a:off x="0" y="0"/>
+                      <a:ext cx="4095750" cy="2286000"/>
+                    </a:xfrm>
+                    <a:prstGeom prst="rect">
+                      <a:avLst/>
+                    </a:prstGeom>
+                  </pic:spPr>
+                </pic:pic>
+              </a:graphicData>
+            </a:graphic>
+          </wp:inline>
+        </w:drawing>
+      </w:r>
+    </w:p>
+    <w:p>
+      <w:pPr>
+        <w:spacing w:after="110" w:line="300"/>
+        <w:jc w:val="both"/>
+      </w:pPr>
+      <w:r>
+        <w:rPr>
+          <w:rFonts w:ascii="Times New Roman" w:cs="Times New Roman" w:eastAsia="Times New Roman" w:hAnsi="Times New Roman"/>
+          <w:b/>
+          <w:bCs/>
+          <w:i w:val="false"/>
+          <w:iCs w:val="false"/>
+          <w:color w:val="2E7D32"/>
+          <w:sz w:val="24"/>
+          <w:szCs w:val="24"/>
+        </w:rPr>
+        <w:t xml:space="preserve">Définition — </w:t>
+      </w:r>
+      <w:r>
+        <w:rPr>
+          <w:rFonts w:ascii="Times New Roman" w:cs="Times New Roman" w:eastAsia="Times New Roman" w:hAnsi="Times New Roman"/>
+          <w:b/>
+          <w:bCs/>
+          <w:i w:val="false"/>
+          <w:iCs w:val="false"/>
+          <w:color w:val="000000"/>
+          <w:sz w:val="24"/>
+          <w:szCs w:val="24"/>
+        </w:rPr>
+        <w:t xml:space="preserve">Une fraction est irréductible lorsque son numérateur et son dénominateur n’ont aucun diviseur commun autre que 1.</w:t>
+      </w:r>
+    </w:p>
+    <w:p>
+      <w:pPr>
+        <w:spacing w:after="110" w:line="300"/>
+        <w:jc w:val="both"/>
+      </w:pPr>
+      <w:r>
+        <w:rPr>
+          <w:rFonts w:ascii="Times New Roman" w:cs="Times New Roman" w:eastAsia="Times New Roman" w:hAnsi="Times New Roman"/>
+          <w:b/>
+          <w:bCs/>
+          <w:i w:val="false"/>
+          <w:iCs w:val="false"/>
+          <w:color w:val="1F4E79"/>
+          <w:sz w:val="24"/>
+          <w:szCs w:val="24"/>
+        </w:rPr>
+        <w:t xml:space="preserve">Autrement dit : </w:t>
+      </w:r>
+      <w:r>
+        <w:rPr>
+          <w:rFonts w:ascii="Times New Roman" w:cs="Times New Roman" w:eastAsia="Times New Roman" w:hAnsi="Times New Roman"/>
+          <w:b w:val="false"/>
+          <w:bCs w:val="false"/>
+          <w:i w:val="false"/>
+          <w:iCs w:val="false"/>
+          <w:color w:val="000000"/>
+          <w:sz w:val="24"/>
+          <w:szCs w:val="24"/>
+        </w:rPr>
+        <w:t xml:space="preserve">c’est la fraction « la plus simple possible » : on ne peut plus la réduire.</w:t>
+      </w:r>
+    </w:p>
+    <w:p>
+      <w:pPr>
+        <w:spacing w:after="110" w:line="300"/>
+        <w:jc w:val="both"/>
+      </w:pPr>
+      <w:r>
+        <w:rPr>
+          <w:rFonts w:ascii="Times New Roman" w:cs="Times New Roman" w:eastAsia="Times New Roman" w:hAnsi="Times New Roman"/>
+          <w:b w:val="false"/>
+          <w:bCs w:val="false"/>
+          <w:i w:val="false"/>
+          <w:iCs w:val="false"/>
+          <w:color w:val="000000"/>
+          <w:sz w:val="24"/>
+          <w:szCs w:val="24"/>
+        </w:rPr>
+        <w:t xml:space="preserve">Pour trouver la forme irréductible, on simplifie autant de fois que nécessaire : </w:t>
+      </w:r>
+      <m:oMath>
+        <m:f>
+          <m:num>
+            <m:r>
+              <m:t>24</m:t>
+            </m:r>
+          </m:num>
+          <m:den>
+            <m:r>
+              <m:t>36</m:t>
+            </m:r>
+          </m:den>
+        </m:f>
+      </m:oMath>
+      <w:r>
+        <w:rPr>
+          <w:rFonts w:ascii="Times New Roman" w:cs="Times New Roman" w:eastAsia="Times New Roman" w:hAnsi="Times New Roman"/>
+          <w:b w:val="false"/>
+          <w:bCs w:val="false"/>
+          <w:i w:val="false"/>
+          <w:iCs w:val="false"/>
+          <w:color w:val="000000"/>
+          <w:sz w:val="24"/>
+          <w:szCs w:val="24"/>
+        </w:rPr>
+        <w:t xml:space="preserve">= </w:t>
+      </w:r>
+      <m:oMath>
+        <m:f>
+          <m:num>
+            <m:r>
+              <m:t>12</m:t>
+            </m:r>
+          </m:num>
+          <m:den>
+            <m:r>
+              <m:t>18</m:t>
+            </m:r>
+          </m:den>
+        </m:f>
+      </m:oMath>
+      <w:r>
+        <w:rPr>
+          <w:rFonts w:ascii="Times New Roman" w:cs="Times New Roman" w:eastAsia="Times New Roman" w:hAnsi="Times New Roman"/>
+          <w:b w:val="false"/>
+          <w:bCs w:val="false"/>
+          <w:i w:val="false"/>
+          <w:iCs w:val="false"/>
+          <w:color w:val="000000"/>
+          <w:sz w:val="24"/>
+          <w:szCs w:val="24"/>
+        </w:rPr>
+        <w:t xml:space="preserve">(÷ 2) = </w:t>
+      </w:r>
+      <m:oMath>
+        <m:f>
+          <m:num>
+            <m:r>
+              <m:t>2</m:t>
+            </m:r>
+          </m:num>
+          <m:den>
+            <m:r>
+              <m:t>3</m:t>
+            </m:r>
+          </m:den>
+        </m:f>
+      </m:oMath>
+      <w:r>
+        <w:rPr>
+          <w:rFonts w:ascii="Times New Roman" w:cs="Times New Roman" w:eastAsia="Times New Roman" w:hAnsi="Times New Roman"/>
+          <w:b w:val="false"/>
+          <w:bCs w:val="false"/>
+          <w:i w:val="false"/>
+          <w:iCs w:val="false"/>
+          <w:color w:val="000000"/>
+          <w:sz w:val="24"/>
+          <w:szCs w:val="24"/>
+        </w:rPr>
+        <w:t xml:space="preserve">(÷ 6). On s’arrête quand 1 est le seul diviseur commun du haut et du bas : 2 et 3 n’ont pas de diviseur commun, donc </w:t>
+      </w:r>
+      <m:oMath>
+        <m:f>
+          <m:num>
+            <m:r>
+              <m:t>2</m:t>
+            </m:r>
+          </m:num>
+          <m:den>
+            <m:r>
+              <m:t>3</m:t>
+            </m:r>
+          </m:den>
+        </m:f>
+      </m:oMath>
+      <w:r>
+        <w:rPr>
+          <w:rFonts w:ascii="Times New Roman" w:cs="Times New Roman" w:eastAsia="Times New Roman" w:hAnsi="Times New Roman"/>
+          <w:b w:val="false"/>
+          <w:bCs w:val="false"/>
+          <w:i w:val="false"/>
+          <w:iCs w:val="false"/>
+          <w:color w:val="000000"/>
+          <w:sz w:val="24"/>
+          <w:szCs w:val="24"/>
+        </w:rPr>
+        <w:t xml:space="preserve">est irréductible. Diviser directement par le plus grand diviseur commun (ici 12) va plus vite.</w:t>
+      </w:r>
+    </w:p>
+    <w:p>
+      <w:pPr>
+        <w:spacing w:after="120" w:before="120"/>
+        <w:jc w:val="center"/>
+      </w:pPr>
+      <w:r>
+        <w:drawing>
+          <wp:inline distT="0" distB="0" distL="0" distR="0">
+            <wp:extent cx="4762500" cy="1552575"/>
+            <wp:effectExtent t="0" r="0" b="0" l="0"/>
+            <wp:docPr id="13" name="" descr="" title=""/>
+            <wp:cNvGraphicFramePr>
+              <a:graphicFrameLocks xmlns:a="http://schemas.openxmlformats.org/drawingml/2006/main" noChangeAspect="1"/>
+            </wp:cNvGraphicFramePr>
+            <a:graphic xmlns:a="http://schemas.openxmlformats.org/drawingml/2006/main">
+              <a:graphicData uri="http://schemas.openxmlformats.org/drawingml/2006/picture">
+                <pic:pic xmlns:pic="http://schemas.openxmlformats.org/drawingml/2006/picture">
+                  <pic:nvPicPr>
+                    <pic:cNvPr id="0" name="" descr=""/>
+                    <pic:cNvPicPr>
+                      <a:picLocks noChangeAspect="1" noChangeArrowheads="1"/>
+                    </pic:cNvPicPr>
+                  </pic:nvPicPr>
+                  <pic:blipFill>
+                    <a:blip r:embed="rId21" cstate="none"/>
                     <a:srcRect/>
                     <a:stretch>
                       <a:fillRect/>
@@ -30693,341 +30969,15 @@
     </w:p>
     <w:p>
       <w:pPr>
-        <w:spacing w:after="110" w:line="300"/>
-        <w:jc w:val="both"/>
-      </w:pPr>
-      <w:r>
-        <w:rPr>
-          <w:rFonts w:ascii="Times New Roman" w:cs="Times New Roman" w:eastAsia="Times New Roman" w:hAnsi="Times New Roman"/>
-          <w:b/>
-          <w:bCs/>
-          <w:i w:val="false"/>
-          <w:iCs w:val="false"/>
-          <w:color w:val="2E7D32"/>
-          <w:sz w:val="24"/>
-          <w:szCs w:val="24"/>
-        </w:rPr>
-        <w:t xml:space="preserve">Définition — </w:t>
-      </w:r>
-      <w:r>
-        <w:rPr>
-          <w:rFonts w:ascii="Times New Roman" w:cs="Times New Roman" w:eastAsia="Times New Roman" w:hAnsi="Times New Roman"/>
-          <w:b/>
-          <w:bCs/>
-          <w:i w:val="false"/>
-          <w:iCs w:val="false"/>
-          <w:color w:val="000000"/>
-          <w:sz w:val="24"/>
-          <w:szCs w:val="24"/>
-        </w:rPr>
-        <w:t xml:space="preserve">Pour additionner ou soustraire deux fractions de dénominateurs différents, on les remplace d’abord par des fractions équivalentes ayant le même dénominateur.</w:t>
-      </w:r>
-    </w:p>
-    <w:p>
-      <w:pPr>
-        <w:spacing w:after="110" w:line="300"/>
-        <w:jc w:val="both"/>
-      </w:pPr>
-      <w:r>
-        <w:rPr>
-          <w:rFonts w:ascii="Times New Roman" w:cs="Times New Roman" w:eastAsia="Times New Roman" w:hAnsi="Times New Roman"/>
-          <w:b/>
-          <w:bCs/>
-          <w:i w:val="false"/>
-          <w:iCs w:val="false"/>
-          <w:color w:val="1F4E79"/>
-          <w:sz w:val="24"/>
-          <w:szCs w:val="24"/>
-        </w:rPr>
-        <w:t xml:space="preserve">Autrement dit : </w:t>
-      </w:r>
-      <w:r>
-        <w:rPr>
-          <w:rFonts w:ascii="Times New Roman" w:cs="Times New Roman" w:eastAsia="Times New Roman" w:hAnsi="Times New Roman"/>
-          <w:b w:val="false"/>
-          <w:bCs w:val="false"/>
-          <w:i w:val="false"/>
-          <w:iCs w:val="false"/>
-          <w:color w:val="000000"/>
-          <w:sz w:val="24"/>
-          <w:szCs w:val="24"/>
-        </w:rPr>
-        <w:t xml:space="preserve">on coupe toutes les parts à la même taille avant de les compter ensemble.</w:t>
-      </w:r>
-    </w:p>
-    <w:p>
-      <w:pPr>
-        <w:spacing w:after="110" w:line="300"/>
-        <w:jc w:val="both"/>
-      </w:pPr>
-      <w:r>
-        <w:rPr>
-          <w:rFonts w:ascii="Times New Roman" w:cs="Times New Roman" w:eastAsia="Times New Roman" w:hAnsi="Times New Roman"/>
-          <w:b w:val="false"/>
-          <w:bCs w:val="false"/>
-          <w:i w:val="false"/>
-          <w:iCs w:val="false"/>
-          <w:color w:val="000000"/>
-          <w:sz w:val="24"/>
-          <w:szCs w:val="24"/>
-        </w:rPr>
-        <w:t xml:space="preserve">Les demis et les tiers ne se comptent pas ensemble directement. On les convertit en sixièmes : </w:t>
-      </w:r>
-      <m:oMath>
-        <m:f>
-          <m:num>
-            <m:r>
-              <m:t>1</m:t>
-            </m:r>
-          </m:num>
-          <m:den>
-            <m:r>
-              <m:t>2</m:t>
-            </m:r>
-          </m:den>
-        </m:f>
-      </m:oMath>
-      <w:r>
-        <w:rPr>
-          <w:rFonts w:ascii="Times New Roman" w:cs="Times New Roman" w:eastAsia="Times New Roman" w:hAnsi="Times New Roman"/>
-          <w:b w:val="false"/>
-          <w:bCs w:val="false"/>
-          <w:i w:val="false"/>
-          <w:iCs w:val="false"/>
-          <w:color w:val="000000"/>
-          <w:sz w:val="24"/>
-          <w:szCs w:val="24"/>
-        </w:rPr>
-        <w:t xml:space="preserve">= </w:t>
-      </w:r>
-      <m:oMath>
-        <m:f>
-          <m:num>
-            <m:r>
-              <m:t>3</m:t>
-            </m:r>
-          </m:num>
-          <m:den>
-            <m:r>
-              <m:t>6</m:t>
-            </m:r>
-          </m:den>
-        </m:f>
-      </m:oMath>
-      <w:r>
-        <w:rPr>
-          <w:rFonts w:ascii="Times New Roman" w:cs="Times New Roman" w:eastAsia="Times New Roman" w:hAnsi="Times New Roman"/>
-          <w:b w:val="false"/>
-          <w:bCs w:val="false"/>
-          <w:i w:val="false"/>
-          <w:iCs w:val="false"/>
-          <w:color w:val="000000"/>
-          <w:sz w:val="24"/>
-          <w:szCs w:val="24"/>
-        </w:rPr>
-        <w:t xml:space="preserve">et </w:t>
-      </w:r>
-      <m:oMath>
-        <m:f>
-          <m:num>
-            <m:r>
-              <m:t>1</m:t>
-            </m:r>
-          </m:num>
-          <m:den>
-            <m:r>
-              <m:t>3</m:t>
-            </m:r>
-          </m:den>
-        </m:f>
-      </m:oMath>
-      <w:r>
-        <w:rPr>
-          <w:rFonts w:ascii="Times New Roman" w:cs="Times New Roman" w:eastAsia="Times New Roman" w:hAnsi="Times New Roman"/>
-          <w:b w:val="false"/>
-          <w:bCs w:val="false"/>
-          <w:i w:val="false"/>
-          <w:iCs w:val="false"/>
-          <w:color w:val="000000"/>
-          <w:sz w:val="24"/>
-          <w:szCs w:val="24"/>
-        </w:rPr>
-        <w:t xml:space="preserve">= </w:t>
-      </w:r>
-      <m:oMath>
-        <m:f>
-          <m:num>
-            <m:r>
-              <m:t>2</m:t>
-            </m:r>
-          </m:num>
-          <m:den>
-            <m:r>
-              <m:t>6</m:t>
-            </m:r>
-          </m:den>
-        </m:f>
-      </m:oMath>
-      <w:r>
-        <w:rPr>
-          <w:rFonts w:ascii="Times New Roman" w:cs="Times New Roman" w:eastAsia="Times New Roman" w:hAnsi="Times New Roman"/>
-          <w:b w:val="false"/>
-          <w:bCs w:val="false"/>
-          <w:i w:val="false"/>
-          <w:iCs w:val="false"/>
-          <w:color w:val="000000"/>
-          <w:sz w:val="24"/>
-          <w:szCs w:val="24"/>
-        </w:rPr>
-        <w:t xml:space="preserve">. Alors </w:t>
-      </w:r>
-      <m:oMath>
-        <m:f>
-          <m:num>
-            <m:r>
-              <m:t>1</m:t>
-            </m:r>
-          </m:num>
-          <m:den>
-            <m:r>
-              <m:t>2</m:t>
-            </m:r>
-          </m:den>
-        </m:f>
-      </m:oMath>
-      <w:r>
-        <w:rPr>
-          <w:rFonts w:ascii="Times New Roman" w:cs="Times New Roman" w:eastAsia="Times New Roman" w:hAnsi="Times New Roman"/>
-          <w:b w:val="false"/>
-          <w:bCs w:val="false"/>
-          <w:i w:val="false"/>
-          <w:iCs w:val="false"/>
-          <w:color w:val="000000"/>
-          <w:sz w:val="24"/>
-          <w:szCs w:val="24"/>
-        </w:rPr>
-        <w:t xml:space="preserve">+ </w:t>
-      </w:r>
-      <m:oMath>
-        <m:f>
-          <m:num>
-            <m:r>
-              <m:t>1</m:t>
-            </m:r>
-          </m:num>
-          <m:den>
-            <m:r>
-              <m:t>3</m:t>
-            </m:r>
-          </m:den>
-        </m:f>
-      </m:oMath>
-      <w:r>
-        <w:rPr>
-          <w:rFonts w:ascii="Times New Roman" w:cs="Times New Roman" w:eastAsia="Times New Roman" w:hAnsi="Times New Roman"/>
-          <w:b w:val="false"/>
-          <w:bCs w:val="false"/>
-          <w:i w:val="false"/>
-          <w:iCs w:val="false"/>
-          <w:color w:val="000000"/>
-          <w:sz w:val="24"/>
-          <w:szCs w:val="24"/>
-        </w:rPr>
-        <w:t xml:space="preserve">= </w:t>
-      </w:r>
-      <m:oMath>
-        <m:f>
-          <m:num>
-            <m:r>
-              <m:t>3</m:t>
-            </m:r>
-          </m:num>
-          <m:den>
-            <m:r>
-              <m:t>6</m:t>
-            </m:r>
-          </m:den>
-        </m:f>
-      </m:oMath>
-      <w:r>
-        <w:rPr>
-          <w:rFonts w:ascii="Times New Roman" w:cs="Times New Roman" w:eastAsia="Times New Roman" w:hAnsi="Times New Roman"/>
-          <w:b w:val="false"/>
-          <w:bCs w:val="false"/>
-          <w:i w:val="false"/>
-          <w:iCs w:val="false"/>
-          <w:color w:val="000000"/>
-          <w:sz w:val="24"/>
-          <w:szCs w:val="24"/>
-        </w:rPr>
-        <w:t xml:space="preserve">+ </w:t>
-      </w:r>
-      <m:oMath>
-        <m:f>
-          <m:num>
-            <m:r>
-              <m:t>2</m:t>
-            </m:r>
-          </m:num>
-          <m:den>
-            <m:r>
-              <m:t>6</m:t>
-            </m:r>
-          </m:den>
-        </m:f>
-      </m:oMath>
-      <w:r>
-        <w:rPr>
-          <w:rFonts w:ascii="Times New Roman" w:cs="Times New Roman" w:eastAsia="Times New Roman" w:hAnsi="Times New Roman"/>
-          <w:b w:val="false"/>
-          <w:bCs w:val="false"/>
-          <w:i w:val="false"/>
-          <w:iCs w:val="false"/>
-          <w:color w:val="000000"/>
-          <w:sz w:val="24"/>
-          <w:szCs w:val="24"/>
-        </w:rPr>
-        <w:t xml:space="preserve">= </w:t>
-      </w:r>
-      <m:oMath>
-        <m:f>
-          <m:num>
-            <m:r>
-              <m:t>5</m:t>
-            </m:r>
-          </m:num>
-          <m:den>
-            <m:r>
-              <m:t>6</m:t>
-            </m:r>
-          </m:den>
-        </m:f>
-      </m:oMath>
-      <w:r>
-        <w:rPr>
-          <w:rFonts w:ascii="Times New Roman" w:cs="Times New Roman" w:eastAsia="Times New Roman" w:hAnsi="Times New Roman"/>
-          <w:b w:val="false"/>
-          <w:bCs w:val="false"/>
-          <w:i w:val="false"/>
-          <w:iCs w:val="false"/>
-          <w:color w:val="000000"/>
-          <w:sz w:val="24"/>
-          <w:szCs w:val="24"/>
-        </w:rPr>
-        <w:t xml:space="preserve">. Le dénominateur commun le plus simple est un multiple commun des deux dénominateurs, par exemple leur PPCM.</w:t>
-      </w:r>
-    </w:p>
-    <w:p>
-      <w:pPr>
         <w:spacing w:after="120" w:before="120"/>
         <w:jc w:val="center"/>
       </w:pPr>
       <w:r>
         <w:drawing>
           <wp:inline distT="0" distB="0" distL="0" distR="0">
-            <wp:extent cx="4762500" cy="1600200"/>
+            <wp:extent cx="4095750" cy="2286000"/>
             <wp:effectExtent t="0" r="0" b="0" l="0"/>
-            <wp:docPr id="8" name="" descr="" title=""/>
+            <wp:docPr id="14" name="" descr="" title=""/>
             <wp:cNvGraphicFramePr>
               <a:graphicFrameLocks xmlns:a="http://schemas.openxmlformats.org/drawingml/2006/main" noChangeAspect="1"/>
             </wp:cNvGraphicFramePr>
@@ -31041,7 +30991,379 @@
                     </pic:cNvPicPr>
                   </pic:nvPicPr>
                   <pic:blipFill>
-                    <a:blip r:embed="rId16" cstate="none"/>
+                    <a:blip r:embed="rId22" cstate="none"/>
+                    <a:srcRect/>
+                    <a:stretch>
+                      <a:fillRect/>
+                    </a:stretch>
+                  </pic:blipFill>
+                  <pic:spPr bwMode="auto">
+                    <a:xfrm>
+                      <a:off x="0" y="0"/>
+                      <a:ext cx="4095750" cy="2286000"/>
+                    </a:xfrm>
+                    <a:prstGeom prst="rect">
+                      <a:avLst/>
+                    </a:prstGeom>
+                  </pic:spPr>
+                </pic:pic>
+              </a:graphicData>
+            </a:graphic>
+          </wp:inline>
+        </w:drawing>
+      </w:r>
+    </w:p>
+    <w:p>
+      <w:pPr>
+        <w:spacing w:after="110" w:line="300"/>
+        <w:jc w:val="both"/>
+      </w:pPr>
+      <w:r>
+        <w:rPr>
+          <w:rFonts w:ascii="Times New Roman" w:cs="Times New Roman" w:eastAsia="Times New Roman" w:hAnsi="Times New Roman"/>
+          <w:b/>
+          <w:bCs/>
+          <w:i w:val="false"/>
+          <w:iCs w:val="false"/>
+          <w:color w:val="2E7D32"/>
+          <w:sz w:val="24"/>
+          <w:szCs w:val="24"/>
+        </w:rPr>
+        <w:t xml:space="preserve">Définition — </w:t>
+      </w:r>
+      <w:r>
+        <w:rPr>
+          <w:rFonts w:ascii="Times New Roman" w:cs="Times New Roman" w:eastAsia="Times New Roman" w:hAnsi="Times New Roman"/>
+          <w:b/>
+          <w:bCs/>
+          <w:i w:val="false"/>
+          <w:iCs w:val="false"/>
+          <w:color w:val="000000"/>
+          <w:sz w:val="24"/>
+          <w:szCs w:val="24"/>
+        </w:rPr>
+        <w:t xml:space="preserve">Pour additionner ou soustraire deux fractions de dénominateurs différents, on les remplace d’abord par des fractions équivalentes ayant le même dénominateur.</w:t>
+      </w:r>
+    </w:p>
+    <w:p>
+      <w:pPr>
+        <w:spacing w:after="110" w:line="300"/>
+        <w:jc w:val="both"/>
+      </w:pPr>
+      <w:r>
+        <w:rPr>
+          <w:rFonts w:ascii="Times New Roman" w:cs="Times New Roman" w:eastAsia="Times New Roman" w:hAnsi="Times New Roman"/>
+          <w:b/>
+          <w:bCs/>
+          <w:i w:val="false"/>
+          <w:iCs w:val="false"/>
+          <w:color w:val="1F4E79"/>
+          <w:sz w:val="24"/>
+          <w:szCs w:val="24"/>
+        </w:rPr>
+        <w:t xml:space="preserve">Autrement dit : </w:t>
+      </w:r>
+      <w:r>
+        <w:rPr>
+          <w:rFonts w:ascii="Times New Roman" w:cs="Times New Roman" w:eastAsia="Times New Roman" w:hAnsi="Times New Roman"/>
+          <w:b w:val="false"/>
+          <w:bCs w:val="false"/>
+          <w:i w:val="false"/>
+          <w:iCs w:val="false"/>
+          <w:color w:val="000000"/>
+          <w:sz w:val="24"/>
+          <w:szCs w:val="24"/>
+        </w:rPr>
+        <w:t xml:space="preserve">on coupe toutes les parts à la même taille avant de les compter ensemble.</w:t>
+      </w:r>
+    </w:p>
+    <w:p>
+      <w:pPr>
+        <w:spacing w:after="110" w:line="300"/>
+        <w:jc w:val="both"/>
+      </w:pPr>
+      <w:r>
+        <w:rPr>
+          <w:rFonts w:ascii="Times New Roman" w:cs="Times New Roman" w:eastAsia="Times New Roman" w:hAnsi="Times New Roman"/>
+          <w:b w:val="false"/>
+          <w:bCs w:val="false"/>
+          <w:i w:val="false"/>
+          <w:iCs w:val="false"/>
+          <w:color w:val="000000"/>
+          <w:sz w:val="24"/>
+          <w:szCs w:val="24"/>
+        </w:rPr>
+        <w:t xml:space="preserve">Les demis et les tiers ne se comptent pas ensemble directement. On les convertit en sixièmes : </w:t>
+      </w:r>
+      <m:oMath>
+        <m:f>
+          <m:num>
+            <m:r>
+              <m:t>1</m:t>
+            </m:r>
+          </m:num>
+          <m:den>
+            <m:r>
+              <m:t>2</m:t>
+            </m:r>
+          </m:den>
+        </m:f>
+      </m:oMath>
+      <w:r>
+        <w:rPr>
+          <w:rFonts w:ascii="Times New Roman" w:cs="Times New Roman" w:eastAsia="Times New Roman" w:hAnsi="Times New Roman"/>
+          <w:b w:val="false"/>
+          <w:bCs w:val="false"/>
+          <w:i w:val="false"/>
+          <w:iCs w:val="false"/>
+          <w:color w:val="000000"/>
+          <w:sz w:val="24"/>
+          <w:szCs w:val="24"/>
+        </w:rPr>
+        <w:t xml:space="preserve">= </w:t>
+      </w:r>
+      <m:oMath>
+        <m:f>
+          <m:num>
+            <m:r>
+              <m:t>3</m:t>
+            </m:r>
+          </m:num>
+          <m:den>
+            <m:r>
+              <m:t>6</m:t>
+            </m:r>
+          </m:den>
+        </m:f>
+      </m:oMath>
+      <w:r>
+        <w:rPr>
+          <w:rFonts w:ascii="Times New Roman" w:cs="Times New Roman" w:eastAsia="Times New Roman" w:hAnsi="Times New Roman"/>
+          <w:b w:val="false"/>
+          <w:bCs w:val="false"/>
+          <w:i w:val="false"/>
+          <w:iCs w:val="false"/>
+          <w:color w:val="000000"/>
+          <w:sz w:val="24"/>
+          <w:szCs w:val="24"/>
+        </w:rPr>
+        <w:t xml:space="preserve">et </w:t>
+      </w:r>
+      <m:oMath>
+        <m:f>
+          <m:num>
+            <m:r>
+              <m:t>1</m:t>
+            </m:r>
+          </m:num>
+          <m:den>
+            <m:r>
+              <m:t>3</m:t>
+            </m:r>
+          </m:den>
+        </m:f>
+      </m:oMath>
+      <w:r>
+        <w:rPr>
+          <w:rFonts w:ascii="Times New Roman" w:cs="Times New Roman" w:eastAsia="Times New Roman" w:hAnsi="Times New Roman"/>
+          <w:b w:val="false"/>
+          <w:bCs w:val="false"/>
+          <w:i w:val="false"/>
+          <w:iCs w:val="false"/>
+          <w:color w:val="000000"/>
+          <w:sz w:val="24"/>
+          <w:szCs w:val="24"/>
+        </w:rPr>
+        <w:t xml:space="preserve">= </w:t>
+      </w:r>
+      <m:oMath>
+        <m:f>
+          <m:num>
+            <m:r>
+              <m:t>2</m:t>
+            </m:r>
+          </m:num>
+          <m:den>
+            <m:r>
+              <m:t>6</m:t>
+            </m:r>
+          </m:den>
+        </m:f>
+      </m:oMath>
+      <w:r>
+        <w:rPr>
+          <w:rFonts w:ascii="Times New Roman" w:cs="Times New Roman" w:eastAsia="Times New Roman" w:hAnsi="Times New Roman"/>
+          <w:b w:val="false"/>
+          <w:bCs w:val="false"/>
+          <w:i w:val="false"/>
+          <w:iCs w:val="false"/>
+          <w:color w:val="000000"/>
+          <w:sz w:val="24"/>
+          <w:szCs w:val="24"/>
+        </w:rPr>
+        <w:t xml:space="preserve">. Alors </w:t>
+      </w:r>
+      <m:oMath>
+        <m:f>
+          <m:num>
+            <m:r>
+              <m:t>1</m:t>
+            </m:r>
+          </m:num>
+          <m:den>
+            <m:r>
+              <m:t>2</m:t>
+            </m:r>
+          </m:den>
+        </m:f>
+      </m:oMath>
+      <w:r>
+        <w:rPr>
+          <w:rFonts w:ascii="Times New Roman" w:cs="Times New Roman" w:eastAsia="Times New Roman" w:hAnsi="Times New Roman"/>
+          <w:b w:val="false"/>
+          <w:bCs w:val="false"/>
+          <w:i w:val="false"/>
+          <w:iCs w:val="false"/>
+          <w:color w:val="000000"/>
+          <w:sz w:val="24"/>
+          <w:szCs w:val="24"/>
+        </w:rPr>
+        <w:t xml:space="preserve">+ </w:t>
+      </w:r>
+      <m:oMath>
+        <m:f>
+          <m:num>
+            <m:r>
+              <m:t>1</m:t>
+            </m:r>
+          </m:num>
+          <m:den>
+            <m:r>
+              <m:t>3</m:t>
+            </m:r>
+          </m:den>
+        </m:f>
+      </m:oMath>
+      <w:r>
+        <w:rPr>
+          <w:rFonts w:ascii="Times New Roman" w:cs="Times New Roman" w:eastAsia="Times New Roman" w:hAnsi="Times New Roman"/>
+          <w:b w:val="false"/>
+          <w:bCs w:val="false"/>
+          <w:i w:val="false"/>
+          <w:iCs w:val="false"/>
+          <w:color w:val="000000"/>
+          <w:sz w:val="24"/>
+          <w:szCs w:val="24"/>
+        </w:rPr>
+        <w:t xml:space="preserve">= </w:t>
+      </w:r>
+      <m:oMath>
+        <m:f>
+          <m:num>
+            <m:r>
+              <m:t>3</m:t>
+            </m:r>
+          </m:num>
+          <m:den>
+            <m:r>
+              <m:t>6</m:t>
+            </m:r>
+          </m:den>
+        </m:f>
+      </m:oMath>
+      <w:r>
+        <w:rPr>
+          <w:rFonts w:ascii="Times New Roman" w:cs="Times New Roman" w:eastAsia="Times New Roman" w:hAnsi="Times New Roman"/>
+          <w:b w:val="false"/>
+          <w:bCs w:val="false"/>
+          <w:i w:val="false"/>
+          <w:iCs w:val="false"/>
+          <w:color w:val="000000"/>
+          <w:sz w:val="24"/>
+          <w:szCs w:val="24"/>
+        </w:rPr>
+        <w:t xml:space="preserve">+ </w:t>
+      </w:r>
+      <m:oMath>
+        <m:f>
+          <m:num>
+            <m:r>
+              <m:t>2</m:t>
+            </m:r>
+          </m:num>
+          <m:den>
+            <m:r>
+              <m:t>6</m:t>
+            </m:r>
+          </m:den>
+        </m:f>
+      </m:oMath>
+      <w:r>
+        <w:rPr>
+          <w:rFonts w:ascii="Times New Roman" w:cs="Times New Roman" w:eastAsia="Times New Roman" w:hAnsi="Times New Roman"/>
+          <w:b w:val="false"/>
+          <w:bCs w:val="false"/>
+          <w:i w:val="false"/>
+          <w:iCs w:val="false"/>
+          <w:color w:val="000000"/>
+          <w:sz w:val="24"/>
+          <w:szCs w:val="24"/>
+        </w:rPr>
+        <w:t xml:space="preserve">= </w:t>
+      </w:r>
+      <m:oMath>
+        <m:f>
+          <m:num>
+            <m:r>
+              <m:t>5</m:t>
+            </m:r>
+          </m:num>
+          <m:den>
+            <m:r>
+              <m:t>6</m:t>
+            </m:r>
+          </m:den>
+        </m:f>
+      </m:oMath>
+      <w:r>
+        <w:rPr>
+          <w:rFonts w:ascii="Times New Roman" w:cs="Times New Roman" w:eastAsia="Times New Roman" w:hAnsi="Times New Roman"/>
+          <w:b w:val="false"/>
+          <w:bCs w:val="false"/>
+          <w:i w:val="false"/>
+          <w:iCs w:val="false"/>
+          <w:color w:val="000000"/>
+          <w:sz w:val="24"/>
+          <w:szCs w:val="24"/>
+        </w:rPr>
+        <w:t xml:space="preserve">. Le dénominateur commun le plus simple est un multiple commun des deux dénominateurs, par exemple leur PPCM.</w:t>
+      </w:r>
+    </w:p>
+    <w:p>
+      <w:pPr>
+        <w:spacing w:after="120" w:before="120"/>
+        <w:jc w:val="center"/>
+      </w:pPr>
+      <w:r>
+        <w:drawing>
+          <wp:inline distT="0" distB="0" distL="0" distR="0">
+            <wp:extent cx="4762500" cy="1600200"/>
+            <wp:effectExtent t="0" r="0" b="0" l="0"/>
+            <wp:docPr id="15" name="" descr="" title=""/>
+            <wp:cNvGraphicFramePr>
+              <a:graphicFrameLocks xmlns:a="http://schemas.openxmlformats.org/drawingml/2006/main" noChangeAspect="1"/>
+            </wp:cNvGraphicFramePr>
+            <a:graphic xmlns:a="http://schemas.openxmlformats.org/drawingml/2006/main">
+              <a:graphicData uri="http://schemas.openxmlformats.org/drawingml/2006/picture">
+                <pic:pic xmlns:pic="http://schemas.openxmlformats.org/drawingml/2006/picture">
+                  <pic:nvPicPr>
+                    <pic:cNvPr id="0" name="" descr=""/>
+                    <pic:cNvPicPr>
+                      <a:picLocks noChangeAspect="1" noChangeArrowheads="1"/>
+                    </pic:cNvPicPr>
+                  </pic:nvPicPr>
+                  <pic:blipFill>
+                    <a:blip r:embed="rId23" cstate="none"/>
                     <a:srcRect/>
                     <a:stretch>
                       <a:fillRect/>
@@ -35689,98 +36011,15 @@
     </w:p>
     <w:p>
       <w:pPr>
-        <w:spacing w:after="110" w:line="300"/>
-        <w:jc w:val="both"/>
-      </w:pPr>
-      <w:r>
-        <w:rPr>
-          <w:rFonts w:ascii="Times New Roman" w:cs="Times New Roman" w:eastAsia="Times New Roman" w:hAnsi="Times New Roman"/>
-          <w:b/>
-          <w:bCs/>
-          <w:i w:val="false"/>
-          <w:iCs w:val="false"/>
-          <w:color w:val="2E7D32"/>
-          <w:sz w:val="24"/>
-          <w:szCs w:val="24"/>
-        </w:rPr>
-        <w:t xml:space="preserve">Définition — </w:t>
-      </w:r>
-      <w:r>
-        <w:rPr>
-          <w:rFonts w:ascii="Times New Roman" w:cs="Times New Roman" w:eastAsia="Times New Roman" w:hAnsi="Times New Roman"/>
-          <w:b/>
-          <w:bCs/>
-          <w:i w:val="false"/>
-          <w:iCs w:val="false"/>
-          <w:color w:val="000000"/>
-          <w:sz w:val="24"/>
-          <w:szCs w:val="24"/>
-        </w:rPr>
-        <w:t xml:space="preserve">Un nombre relatif est un nombre muni d’un signe : les nombres positifs sont précédés du signe + et les nombres négatifs du signe −. Le nombre 0 est à la fois positif et négatif.</w:t>
-      </w:r>
-    </w:p>
-    <w:p>
-      <w:pPr>
-        <w:spacing w:after="110" w:line="300"/>
-        <w:jc w:val="both"/>
-      </w:pPr>
-      <w:r>
-        <w:rPr>
-          <w:rFonts w:ascii="Times New Roman" w:cs="Times New Roman" w:eastAsia="Times New Roman" w:hAnsi="Times New Roman"/>
-          <w:b/>
-          <w:bCs/>
-          <w:i w:val="false"/>
-          <w:iCs w:val="false"/>
-          <w:color w:val="1F4E79"/>
-          <w:sz w:val="24"/>
-          <w:szCs w:val="24"/>
-        </w:rPr>
-        <w:t xml:space="preserve">Autrement dit : </w:t>
-      </w:r>
-      <w:r>
-        <w:rPr>
-          <w:rFonts w:ascii="Times New Roman" w:cs="Times New Roman" w:eastAsia="Times New Roman" w:hAnsi="Times New Roman"/>
-          <w:b w:val="false"/>
-          <w:bCs w:val="false"/>
-          <w:i w:val="false"/>
-          <w:iCs w:val="false"/>
-          <w:color w:val="000000"/>
-          <w:sz w:val="24"/>
-          <w:szCs w:val="24"/>
-        </w:rPr>
-        <w:t xml:space="preserve">les nombres négatifs décrivent « en dessous de zéro » : −3 °C, c’est 3 degrés sous zéro ; +5 °C, c’est 5 degrés au-dessus.</w:t>
-      </w:r>
-    </w:p>
-    <w:p>
-      <w:pPr>
-        <w:spacing w:after="110" w:line="300"/>
-        <w:jc w:val="both"/>
-      </w:pPr>
-      <w:r>
-        <w:rPr>
-          <w:rFonts w:ascii="Times New Roman" w:cs="Times New Roman" w:eastAsia="Times New Roman" w:hAnsi="Times New Roman"/>
-          <w:b w:val="false"/>
-          <w:bCs w:val="false"/>
-          <w:i w:val="false"/>
-          <w:iCs w:val="false"/>
-          <w:color w:val="000000"/>
-          <w:sz w:val="24"/>
-          <w:szCs w:val="24"/>
-        </w:rPr>
-        <w:t xml:space="preserve">Les nombres relatifs servent à repérer des situations opposées autour d’un zéro : températures (−3 °C), altitudes (−10 m sous la mer), dettes et gains (−2 000 Ar). Les entiers relatifs sont …, −3, −2, −1, 0, +1, +2, … ; les décimaux relatifs comme −2,5 ou +0,75 complètent cette famille. Écrire +5 ou simplement 5 revient au même.</w:t>
-      </w:r>
-    </w:p>
-    <w:p>
-      <w:pPr>
         <w:spacing w:after="120" w:before="120"/>
         <w:jc w:val="center"/>
       </w:pPr>
       <w:r>
         <w:drawing>
           <wp:inline distT="0" distB="0" distL="0" distR="0">
-            <wp:extent cx="4762500" cy="2495550"/>
+            <wp:extent cx="4095750" cy="2286000"/>
             <wp:effectExtent t="0" r="0" b="0" l="0"/>
-            <wp:docPr id="9" name="" descr="" title=""/>
+            <wp:docPr id="16" name="" descr="" title=""/>
             <wp:cNvGraphicFramePr>
               <a:graphicFrameLocks xmlns:a="http://schemas.openxmlformats.org/drawingml/2006/main" noChangeAspect="1"/>
             </wp:cNvGraphicFramePr>
@@ -35794,7 +36033,136 @@
                     </pic:cNvPicPr>
                   </pic:nvPicPr>
                   <pic:blipFill>
-                    <a:blip r:embed="rId17" cstate="none"/>
+                    <a:blip r:embed="rId24" cstate="none"/>
+                    <a:srcRect/>
+                    <a:stretch>
+                      <a:fillRect/>
+                    </a:stretch>
+                  </pic:blipFill>
+                  <pic:spPr bwMode="auto">
+                    <a:xfrm>
+                      <a:off x="0" y="0"/>
+                      <a:ext cx="4095750" cy="2286000"/>
+                    </a:xfrm>
+                    <a:prstGeom prst="rect">
+                      <a:avLst/>
+                    </a:prstGeom>
+                  </pic:spPr>
+                </pic:pic>
+              </a:graphicData>
+            </a:graphic>
+          </wp:inline>
+        </w:drawing>
+      </w:r>
+    </w:p>
+    <w:p>
+      <w:pPr>
+        <w:spacing w:after="110" w:line="300"/>
+        <w:jc w:val="both"/>
+      </w:pPr>
+      <w:r>
+        <w:rPr>
+          <w:rFonts w:ascii="Times New Roman" w:cs="Times New Roman" w:eastAsia="Times New Roman" w:hAnsi="Times New Roman"/>
+          <w:b/>
+          <w:bCs/>
+          <w:i w:val="false"/>
+          <w:iCs w:val="false"/>
+          <w:color w:val="2E7D32"/>
+          <w:sz w:val="24"/>
+          <w:szCs w:val="24"/>
+        </w:rPr>
+        <w:t xml:space="preserve">Définition — </w:t>
+      </w:r>
+      <w:r>
+        <w:rPr>
+          <w:rFonts w:ascii="Times New Roman" w:cs="Times New Roman" w:eastAsia="Times New Roman" w:hAnsi="Times New Roman"/>
+          <w:b/>
+          <w:bCs/>
+          <w:i w:val="false"/>
+          <w:iCs w:val="false"/>
+          <w:color w:val="000000"/>
+          <w:sz w:val="24"/>
+          <w:szCs w:val="24"/>
+        </w:rPr>
+        <w:t xml:space="preserve">Un nombre relatif est un nombre muni d’un signe : les nombres positifs sont précédés du signe + et les nombres négatifs du signe −. Le nombre 0 est à la fois positif et négatif.</w:t>
+      </w:r>
+    </w:p>
+    <w:p>
+      <w:pPr>
+        <w:spacing w:after="110" w:line="300"/>
+        <w:jc w:val="both"/>
+      </w:pPr>
+      <w:r>
+        <w:rPr>
+          <w:rFonts w:ascii="Times New Roman" w:cs="Times New Roman" w:eastAsia="Times New Roman" w:hAnsi="Times New Roman"/>
+          <w:b/>
+          <w:bCs/>
+          <w:i w:val="false"/>
+          <w:iCs w:val="false"/>
+          <w:color w:val="1F4E79"/>
+          <w:sz w:val="24"/>
+          <w:szCs w:val="24"/>
+        </w:rPr>
+        <w:t xml:space="preserve">Autrement dit : </w:t>
+      </w:r>
+      <w:r>
+        <w:rPr>
+          <w:rFonts w:ascii="Times New Roman" w:cs="Times New Roman" w:eastAsia="Times New Roman" w:hAnsi="Times New Roman"/>
+          <w:b w:val="false"/>
+          <w:bCs w:val="false"/>
+          <w:i w:val="false"/>
+          <w:iCs w:val="false"/>
+          <w:color w:val="000000"/>
+          <w:sz w:val="24"/>
+          <w:szCs w:val="24"/>
+        </w:rPr>
+        <w:t xml:space="preserve">les nombres négatifs décrivent « en dessous de zéro » : −3 °C, c’est 3 degrés sous zéro ; +5 °C, c’est 5 degrés au-dessus.</w:t>
+      </w:r>
+    </w:p>
+    <w:p>
+      <w:pPr>
+        <w:spacing w:after="110" w:line="300"/>
+        <w:jc w:val="both"/>
+      </w:pPr>
+      <w:r>
+        <w:rPr>
+          <w:rFonts w:ascii="Times New Roman" w:cs="Times New Roman" w:eastAsia="Times New Roman" w:hAnsi="Times New Roman"/>
+          <w:b w:val="false"/>
+          <w:bCs w:val="false"/>
+          <w:i w:val="false"/>
+          <w:iCs w:val="false"/>
+          <w:color w:val="000000"/>
+          <w:sz w:val="24"/>
+          <w:szCs w:val="24"/>
+        </w:rPr>
+        <w:t xml:space="preserve">Les nombres relatifs servent à repérer des situations opposées autour d’un zéro : températures (−3 °C), altitudes (−10 m sous la mer), dettes et gains (−2 000 Ar). Les entiers relatifs sont …, −3, −2, −1, 0, +1, +2, … ; les décimaux relatifs comme −2,5 ou +0,75 complètent cette famille. Écrire +5 ou simplement 5 revient au même.</w:t>
+      </w:r>
+    </w:p>
+    <w:p>
+      <w:pPr>
+        <w:spacing w:after="120" w:before="120"/>
+        <w:jc w:val="center"/>
+      </w:pPr>
+      <w:r>
+        <w:drawing>
+          <wp:inline distT="0" distB="0" distL="0" distR="0">
+            <wp:extent cx="4762500" cy="2495550"/>
+            <wp:effectExtent t="0" r="0" b="0" l="0"/>
+            <wp:docPr id="17" name="" descr="" title=""/>
+            <wp:cNvGraphicFramePr>
+              <a:graphicFrameLocks xmlns:a="http://schemas.openxmlformats.org/drawingml/2006/main" noChangeAspect="1"/>
+            </wp:cNvGraphicFramePr>
+            <a:graphic xmlns:a="http://schemas.openxmlformats.org/drawingml/2006/main">
+              <a:graphicData uri="http://schemas.openxmlformats.org/drawingml/2006/picture">
+                <pic:pic xmlns:pic="http://schemas.openxmlformats.org/drawingml/2006/picture">
+                  <pic:nvPicPr>
+                    <pic:cNvPr id="0" name="" descr=""/>
+                    <pic:cNvPicPr>
+                      <a:picLocks noChangeAspect="1" noChangeArrowheads="1"/>
+                    </pic:cNvPicPr>
+                  </pic:nvPicPr>
+                  <pic:blipFill>
+                    <a:blip r:embed="rId25" cstate="none"/>
                     <a:srcRect/>
                     <a:stretch>
                       <a:fillRect/>
@@ -38538,98 +38906,15 @@
     </w:p>
     <w:p>
       <w:pPr>
-        <w:spacing w:after="110" w:line="300"/>
-        <w:jc w:val="both"/>
-      </w:pPr>
-      <w:r>
-        <w:rPr>
-          <w:rFonts w:ascii="Times New Roman" w:cs="Times New Roman" w:eastAsia="Times New Roman" w:hAnsi="Times New Roman"/>
-          <w:b/>
-          <w:bCs/>
-          <w:i w:val="false"/>
-          <w:iCs w:val="false"/>
-          <w:color w:val="2E7D32"/>
-          <w:sz w:val="24"/>
-          <w:szCs w:val="24"/>
-        </w:rPr>
-        <w:t xml:space="preserve">Définition — </w:t>
-      </w:r>
-      <w:r>
-        <w:rPr>
-          <w:rFonts w:ascii="Times New Roman" w:cs="Times New Roman" w:eastAsia="Times New Roman" w:hAnsi="Times New Roman"/>
-          <w:b/>
-          <w:bCs/>
-          <w:i w:val="false"/>
-          <w:iCs w:val="false"/>
-          <w:color w:val="000000"/>
-          <w:sz w:val="24"/>
-          <w:szCs w:val="24"/>
-        </w:rPr>
-        <w:t xml:space="preserve">Sur une droite graduée, chaque point est repéré par un nombre appelé son abscisse. Le point d’abscisse 0 est l’origine ; les abscisses positives sont à droite de l’origine et les abscisses négatives à gauche.</w:t>
-      </w:r>
-    </w:p>
-    <w:p>
-      <w:pPr>
-        <w:spacing w:after="110" w:line="300"/>
-        <w:jc w:val="both"/>
-      </w:pPr>
-      <w:r>
-        <w:rPr>
-          <w:rFonts w:ascii="Times New Roman" w:cs="Times New Roman" w:eastAsia="Times New Roman" w:hAnsi="Times New Roman"/>
-          <w:b/>
-          <w:bCs/>
-          <w:i w:val="false"/>
-          <w:iCs w:val="false"/>
-          <w:color w:val="1F4E79"/>
-          <w:sz w:val="24"/>
-          <w:szCs w:val="24"/>
-        </w:rPr>
-        <w:t xml:space="preserve">Autrement dit : </w:t>
-      </w:r>
-      <w:r>
-        <w:rPr>
-          <w:rFonts w:ascii="Times New Roman" w:cs="Times New Roman" w:eastAsia="Times New Roman" w:hAnsi="Times New Roman"/>
-          <w:b w:val="false"/>
-          <w:bCs w:val="false"/>
-          <w:i w:val="false"/>
-          <w:iCs w:val="false"/>
-          <w:color w:val="000000"/>
-          <w:sz w:val="24"/>
-          <w:szCs w:val="24"/>
-        </w:rPr>
-        <w:t xml:space="preserve">la droite graduée est une règle qui continue aussi à gauche de zéro, avec les nombres à signe −.</w:t>
-      </w:r>
-    </w:p>
-    <w:p>
-      <w:pPr>
-        <w:spacing w:after="110" w:line="300"/>
-        <w:jc w:val="both"/>
-      </w:pPr>
-      <w:r>
-        <w:rPr>
-          <w:rFonts w:ascii="Times New Roman" w:cs="Times New Roman" w:eastAsia="Times New Roman" w:hAnsi="Times New Roman"/>
-          <w:b w:val="false"/>
-          <w:bCs w:val="false"/>
-          <w:i w:val="false"/>
-          <w:iCs w:val="false"/>
-          <w:color w:val="000000"/>
-          <w:sz w:val="24"/>
-          <w:szCs w:val="24"/>
-        </w:rPr>
-        <w:t xml:space="preserve">Pour placer un entier relatif, on part de l’origine 0 : on avance vers la droite pour un positif, vers la gauche pour un négatif. Le point A d’abscisse −4 se note A(−4). Deux nombres opposés, comme −3 et +3, sont symétriques par rapport à l’origine : ils sont à la même distance de 0.</w:t>
-      </w:r>
-    </w:p>
-    <w:p>
-      <w:pPr>
         <w:spacing w:after="120" w:before="120"/>
         <w:jc w:val="center"/>
       </w:pPr>
       <w:r>
         <w:drawing>
           <wp:inline distT="0" distB="0" distL="0" distR="0">
-            <wp:extent cx="4762500" cy="1495425"/>
+            <wp:extent cx="4095750" cy="2286000"/>
             <wp:effectExtent t="0" r="0" b="0" l="0"/>
-            <wp:docPr id="10" name="" descr="" title=""/>
+            <wp:docPr id="18" name="" descr="" title=""/>
             <wp:cNvGraphicFramePr>
               <a:graphicFrameLocks xmlns:a="http://schemas.openxmlformats.org/drawingml/2006/main" noChangeAspect="1"/>
             </wp:cNvGraphicFramePr>
@@ -38643,7 +38928,136 @@
                     </pic:cNvPicPr>
                   </pic:nvPicPr>
                   <pic:blipFill>
-                    <a:blip r:embed="rId18" cstate="none"/>
+                    <a:blip r:embed="rId26" cstate="none"/>
+                    <a:srcRect/>
+                    <a:stretch>
+                      <a:fillRect/>
+                    </a:stretch>
+                  </pic:blipFill>
+                  <pic:spPr bwMode="auto">
+                    <a:xfrm>
+                      <a:off x="0" y="0"/>
+                      <a:ext cx="4095750" cy="2286000"/>
+                    </a:xfrm>
+                    <a:prstGeom prst="rect">
+                      <a:avLst/>
+                    </a:prstGeom>
+                  </pic:spPr>
+                </pic:pic>
+              </a:graphicData>
+            </a:graphic>
+          </wp:inline>
+        </w:drawing>
+      </w:r>
+    </w:p>
+    <w:p>
+      <w:pPr>
+        <w:spacing w:after="110" w:line="300"/>
+        <w:jc w:val="both"/>
+      </w:pPr>
+      <w:r>
+        <w:rPr>
+          <w:rFonts w:ascii="Times New Roman" w:cs="Times New Roman" w:eastAsia="Times New Roman" w:hAnsi="Times New Roman"/>
+          <w:b/>
+          <w:bCs/>
+          <w:i w:val="false"/>
+          <w:iCs w:val="false"/>
+          <w:color w:val="2E7D32"/>
+          <w:sz w:val="24"/>
+          <w:szCs w:val="24"/>
+        </w:rPr>
+        <w:t xml:space="preserve">Définition — </w:t>
+      </w:r>
+      <w:r>
+        <w:rPr>
+          <w:rFonts w:ascii="Times New Roman" w:cs="Times New Roman" w:eastAsia="Times New Roman" w:hAnsi="Times New Roman"/>
+          <w:b/>
+          <w:bCs/>
+          <w:i w:val="false"/>
+          <w:iCs w:val="false"/>
+          <w:color w:val="000000"/>
+          <w:sz w:val="24"/>
+          <w:szCs w:val="24"/>
+        </w:rPr>
+        <w:t xml:space="preserve">Sur une droite graduée, chaque point est repéré par un nombre appelé son abscisse. Le point d’abscisse 0 est l’origine ; les abscisses positives sont à droite de l’origine et les abscisses négatives à gauche.</w:t>
+      </w:r>
+    </w:p>
+    <w:p>
+      <w:pPr>
+        <w:spacing w:after="110" w:line="300"/>
+        <w:jc w:val="both"/>
+      </w:pPr>
+      <w:r>
+        <w:rPr>
+          <w:rFonts w:ascii="Times New Roman" w:cs="Times New Roman" w:eastAsia="Times New Roman" w:hAnsi="Times New Roman"/>
+          <w:b/>
+          <w:bCs/>
+          <w:i w:val="false"/>
+          <w:iCs w:val="false"/>
+          <w:color w:val="1F4E79"/>
+          <w:sz w:val="24"/>
+          <w:szCs w:val="24"/>
+        </w:rPr>
+        <w:t xml:space="preserve">Autrement dit : </w:t>
+      </w:r>
+      <w:r>
+        <w:rPr>
+          <w:rFonts w:ascii="Times New Roman" w:cs="Times New Roman" w:eastAsia="Times New Roman" w:hAnsi="Times New Roman"/>
+          <w:b w:val="false"/>
+          <w:bCs w:val="false"/>
+          <w:i w:val="false"/>
+          <w:iCs w:val="false"/>
+          <w:color w:val="000000"/>
+          <w:sz w:val="24"/>
+          <w:szCs w:val="24"/>
+        </w:rPr>
+        <w:t xml:space="preserve">la droite graduée est une règle qui continue aussi à gauche de zéro, avec les nombres à signe −.</w:t>
+      </w:r>
+    </w:p>
+    <w:p>
+      <w:pPr>
+        <w:spacing w:after="110" w:line="300"/>
+        <w:jc w:val="both"/>
+      </w:pPr>
+      <w:r>
+        <w:rPr>
+          <w:rFonts w:ascii="Times New Roman" w:cs="Times New Roman" w:eastAsia="Times New Roman" w:hAnsi="Times New Roman"/>
+          <w:b w:val="false"/>
+          <w:bCs w:val="false"/>
+          <w:i w:val="false"/>
+          <w:iCs w:val="false"/>
+          <w:color w:val="000000"/>
+          <w:sz w:val="24"/>
+          <w:szCs w:val="24"/>
+        </w:rPr>
+        <w:t xml:space="preserve">Pour placer un entier relatif, on part de l’origine 0 : on avance vers la droite pour un positif, vers la gauche pour un négatif. Le point A d’abscisse −4 se note A(−4). Deux nombres opposés, comme −3 et +3, sont symétriques par rapport à l’origine : ils sont à la même distance de 0.</w:t>
+      </w:r>
+    </w:p>
+    <w:p>
+      <w:pPr>
+        <w:spacing w:after="120" w:before="120"/>
+        <w:jc w:val="center"/>
+      </w:pPr>
+      <w:r>
+        <w:drawing>
+          <wp:inline distT="0" distB="0" distL="0" distR="0">
+            <wp:extent cx="4762500" cy="1495425"/>
+            <wp:effectExtent t="0" r="0" b="0" l="0"/>
+            <wp:docPr id="19" name="" descr="" title=""/>
+            <wp:cNvGraphicFramePr>
+              <a:graphicFrameLocks xmlns:a="http://schemas.openxmlformats.org/drawingml/2006/main" noChangeAspect="1"/>
+            </wp:cNvGraphicFramePr>
+            <a:graphic xmlns:a="http://schemas.openxmlformats.org/drawingml/2006/main">
+              <a:graphicData uri="http://schemas.openxmlformats.org/drawingml/2006/picture">
+                <pic:pic xmlns:pic="http://schemas.openxmlformats.org/drawingml/2006/picture">
+                  <pic:nvPicPr>
+                    <pic:cNvPr id="0" name="" descr=""/>
+                    <pic:cNvPicPr>
+                      <a:picLocks noChangeAspect="1" noChangeArrowheads="1"/>
+                    </pic:cNvPicPr>
+                  </pic:nvPicPr>
+                  <pic:blipFill>
+                    <a:blip r:embed="rId27" cstate="none"/>
                     <a:srcRect/>
                     <a:stretch>
                       <a:fillRect/>
@@ -41387,98 +41801,15 @@
     </w:p>
     <w:p>
       <w:pPr>
-        <w:spacing w:after="110" w:line="300"/>
-        <w:jc w:val="both"/>
-      </w:pPr>
-      <w:r>
-        <w:rPr>
-          <w:rFonts w:ascii="Times New Roman" w:cs="Times New Roman" w:eastAsia="Times New Roman" w:hAnsi="Times New Roman"/>
-          <w:b/>
-          <w:bCs/>
-          <w:i w:val="false"/>
-          <w:iCs w:val="false"/>
-          <w:color w:val="2E7D32"/>
-          <w:sz w:val="24"/>
-          <w:szCs w:val="24"/>
-        </w:rPr>
-        <w:t xml:space="preserve">Définition — </w:t>
-      </w:r>
-      <w:r>
-        <w:rPr>
-          <w:rFonts w:ascii="Times New Roman" w:cs="Times New Roman" w:eastAsia="Times New Roman" w:hAnsi="Times New Roman"/>
-          <w:b/>
-          <w:bCs/>
-          <w:i w:val="false"/>
-          <w:iCs w:val="false"/>
-          <w:color w:val="000000"/>
-          <w:sz w:val="24"/>
-          <w:szCs w:val="24"/>
-        </w:rPr>
-        <w:t xml:space="preserve">Les nombres décimaux relatifs se placent sur la droite graduée en partageant chaque unité en parts égales : dixièmes, demis, quarts…</w:t>
-      </w:r>
-    </w:p>
-    <w:p>
-      <w:pPr>
-        <w:spacing w:after="110" w:line="300"/>
-        <w:jc w:val="both"/>
-      </w:pPr>
-      <w:r>
-        <w:rPr>
-          <w:rFonts w:ascii="Times New Roman" w:cs="Times New Roman" w:eastAsia="Times New Roman" w:hAnsi="Times New Roman"/>
-          <w:b/>
-          <w:bCs/>
-          <w:i w:val="false"/>
-          <w:iCs w:val="false"/>
-          <w:color w:val="1F4E79"/>
-          <w:sz w:val="24"/>
-          <w:szCs w:val="24"/>
-        </w:rPr>
-        <w:t xml:space="preserve">Autrement dit : </w:t>
-      </w:r>
-      <w:r>
-        <w:rPr>
-          <w:rFonts w:ascii="Times New Roman" w:cs="Times New Roman" w:eastAsia="Times New Roman" w:hAnsi="Times New Roman"/>
-          <w:b w:val="false"/>
-          <w:bCs w:val="false"/>
-          <w:i w:val="false"/>
-          <w:iCs w:val="false"/>
-          <w:color w:val="000000"/>
-          <w:sz w:val="24"/>
-          <w:szCs w:val="24"/>
-        </w:rPr>
-        <w:t xml:space="preserve">entre deux graduations entières, il y a de la place pour tous les décimaux : −1,5 est exactement au milieu de −2 et −1.</w:t>
-      </w:r>
-    </w:p>
-    <w:p>
-      <w:pPr>
-        <w:spacing w:after="110" w:line="300"/>
-        <w:jc w:val="both"/>
-      </w:pPr>
-      <w:r>
-        <w:rPr>
-          <w:rFonts w:ascii="Times New Roman" w:cs="Times New Roman" w:eastAsia="Times New Roman" w:hAnsi="Times New Roman"/>
-          <w:b w:val="false"/>
-          <w:bCs w:val="false"/>
-          <w:i w:val="false"/>
-          <w:iCs w:val="false"/>
-          <w:color w:val="000000"/>
-          <w:sz w:val="24"/>
-          <w:szCs w:val="24"/>
-        </w:rPr>
-        <w:t xml:space="preserve">Pour placer −1,5, on repère d’abord l’encadrement entre entiers : −2 &lt; −1,5 &lt; −1 ; puis on partage cette unité en dixièmes ou en demis. Attention au sens : −1,5 est plus loin de zéro que −1. De même, +0,5 est au milieu de 0 et +1.</w:t>
-      </w:r>
-    </w:p>
-    <w:p>
-      <w:pPr>
         <w:spacing w:after="120" w:before="120"/>
         <w:jc w:val="center"/>
       </w:pPr>
       <w:r>
         <w:drawing>
           <wp:inline distT="0" distB="0" distL="0" distR="0">
-            <wp:extent cx="4762500" cy="1495425"/>
+            <wp:extent cx="4095750" cy="2286000"/>
             <wp:effectExtent t="0" r="0" b="0" l="0"/>
-            <wp:docPr id="11" name="" descr="" title=""/>
+            <wp:docPr id="20" name="" descr="" title=""/>
             <wp:cNvGraphicFramePr>
               <a:graphicFrameLocks xmlns:a="http://schemas.openxmlformats.org/drawingml/2006/main" noChangeAspect="1"/>
             </wp:cNvGraphicFramePr>
@@ -41492,7 +41823,136 @@
                     </pic:cNvPicPr>
                   </pic:nvPicPr>
                   <pic:blipFill>
-                    <a:blip r:embed="rId19" cstate="none"/>
+                    <a:blip r:embed="rId28" cstate="none"/>
+                    <a:srcRect/>
+                    <a:stretch>
+                      <a:fillRect/>
+                    </a:stretch>
+                  </pic:blipFill>
+                  <pic:spPr bwMode="auto">
+                    <a:xfrm>
+                      <a:off x="0" y="0"/>
+                      <a:ext cx="4095750" cy="2286000"/>
+                    </a:xfrm>
+                    <a:prstGeom prst="rect">
+                      <a:avLst/>
+                    </a:prstGeom>
+                  </pic:spPr>
+                </pic:pic>
+              </a:graphicData>
+            </a:graphic>
+          </wp:inline>
+        </w:drawing>
+      </w:r>
+    </w:p>
+    <w:p>
+      <w:pPr>
+        <w:spacing w:after="110" w:line="300"/>
+        <w:jc w:val="both"/>
+      </w:pPr>
+      <w:r>
+        <w:rPr>
+          <w:rFonts w:ascii="Times New Roman" w:cs="Times New Roman" w:eastAsia="Times New Roman" w:hAnsi="Times New Roman"/>
+          <w:b/>
+          <w:bCs/>
+          <w:i w:val="false"/>
+          <w:iCs w:val="false"/>
+          <w:color w:val="2E7D32"/>
+          <w:sz w:val="24"/>
+          <w:szCs w:val="24"/>
+        </w:rPr>
+        <w:t xml:space="preserve">Définition — </w:t>
+      </w:r>
+      <w:r>
+        <w:rPr>
+          <w:rFonts w:ascii="Times New Roman" w:cs="Times New Roman" w:eastAsia="Times New Roman" w:hAnsi="Times New Roman"/>
+          <w:b/>
+          <w:bCs/>
+          <w:i w:val="false"/>
+          <w:iCs w:val="false"/>
+          <w:color w:val="000000"/>
+          <w:sz w:val="24"/>
+          <w:szCs w:val="24"/>
+        </w:rPr>
+        <w:t xml:space="preserve">Les nombres décimaux relatifs se placent sur la droite graduée en partageant chaque unité en parts égales : dixièmes, demis, quarts…</w:t>
+      </w:r>
+    </w:p>
+    <w:p>
+      <w:pPr>
+        <w:spacing w:after="110" w:line="300"/>
+        <w:jc w:val="both"/>
+      </w:pPr>
+      <w:r>
+        <w:rPr>
+          <w:rFonts w:ascii="Times New Roman" w:cs="Times New Roman" w:eastAsia="Times New Roman" w:hAnsi="Times New Roman"/>
+          <w:b/>
+          <w:bCs/>
+          <w:i w:val="false"/>
+          <w:iCs w:val="false"/>
+          <w:color w:val="1F4E79"/>
+          <w:sz w:val="24"/>
+          <w:szCs w:val="24"/>
+        </w:rPr>
+        <w:t xml:space="preserve">Autrement dit : </w:t>
+      </w:r>
+      <w:r>
+        <w:rPr>
+          <w:rFonts w:ascii="Times New Roman" w:cs="Times New Roman" w:eastAsia="Times New Roman" w:hAnsi="Times New Roman"/>
+          <w:b w:val="false"/>
+          <w:bCs w:val="false"/>
+          <w:i w:val="false"/>
+          <w:iCs w:val="false"/>
+          <w:color w:val="000000"/>
+          <w:sz w:val="24"/>
+          <w:szCs w:val="24"/>
+        </w:rPr>
+        <w:t xml:space="preserve">entre deux graduations entières, il y a de la place pour tous les décimaux : −1,5 est exactement au milieu de −2 et −1.</w:t>
+      </w:r>
+    </w:p>
+    <w:p>
+      <w:pPr>
+        <w:spacing w:after="110" w:line="300"/>
+        <w:jc w:val="both"/>
+      </w:pPr>
+      <w:r>
+        <w:rPr>
+          <w:rFonts w:ascii="Times New Roman" w:cs="Times New Roman" w:eastAsia="Times New Roman" w:hAnsi="Times New Roman"/>
+          <w:b w:val="false"/>
+          <w:bCs w:val="false"/>
+          <w:i w:val="false"/>
+          <w:iCs w:val="false"/>
+          <w:color w:val="000000"/>
+          <w:sz w:val="24"/>
+          <w:szCs w:val="24"/>
+        </w:rPr>
+        <w:t xml:space="preserve">Pour placer −1,5, on repère d’abord l’encadrement entre entiers : −2 &lt; −1,5 &lt; −1 ; puis on partage cette unité en dixièmes ou en demis. Attention au sens : −1,5 est plus loin de zéro que −1. De même, +0,5 est au milieu de 0 et +1.</w:t>
+      </w:r>
+    </w:p>
+    <w:p>
+      <w:pPr>
+        <w:spacing w:after="120" w:before="120"/>
+        <w:jc w:val="center"/>
+      </w:pPr>
+      <w:r>
+        <w:drawing>
+          <wp:inline distT="0" distB="0" distL="0" distR="0">
+            <wp:extent cx="4762500" cy="1495425"/>
+            <wp:effectExtent t="0" r="0" b="0" l="0"/>
+            <wp:docPr id="21" name="" descr="" title=""/>
+            <wp:cNvGraphicFramePr>
+              <a:graphicFrameLocks xmlns:a="http://schemas.openxmlformats.org/drawingml/2006/main" noChangeAspect="1"/>
+            </wp:cNvGraphicFramePr>
+            <a:graphic xmlns:a="http://schemas.openxmlformats.org/drawingml/2006/main">
+              <a:graphicData uri="http://schemas.openxmlformats.org/drawingml/2006/picture">
+                <pic:pic xmlns:pic="http://schemas.openxmlformats.org/drawingml/2006/picture">
+                  <pic:nvPicPr>
+                    <pic:cNvPr id="0" name="" descr=""/>
+                    <pic:cNvPicPr>
+                      <a:picLocks noChangeAspect="1" noChangeArrowheads="1"/>
+                    </pic:cNvPicPr>
+                  </pic:nvPicPr>
+                  <pic:blipFill>
+                    <a:blip r:embed="rId29" cstate="none"/>
                     <a:srcRect/>
                     <a:stretch>
                       <a:fillRect/>
@@ -44327,7 +44787,7 @@
           <wp:inline distT="0" distB="0" distL="0" distR="0">
             <wp:extent cx="4762500" cy="1600200"/>
             <wp:effectExtent t="0" r="0" b="0" l="0"/>
-            <wp:docPr id="12" name="" descr="" title=""/>
+            <wp:docPr id="22" name="" descr="" title=""/>
             <wp:cNvGraphicFramePr>
               <a:graphicFrameLocks xmlns:a="http://schemas.openxmlformats.org/drawingml/2006/main" noChangeAspect="1"/>
             </wp:cNvGraphicFramePr>
@@ -44341,7 +44801,7 @@
                     </pic:cNvPicPr>
                   </pic:nvPicPr>
                   <pic:blipFill>
-                    <a:blip r:embed="rId20" cstate="none"/>
+                    <a:blip r:embed="rId30" cstate="none"/>
                     <a:srcRect/>
                     <a:stretch>
                       <a:fillRect/>
@@ -47257,7 +47717,7 @@
           <wp:inline distT="0" distB="0" distL="0" distR="0">
             <wp:extent cx="4762500" cy="2076450"/>
             <wp:effectExtent t="0" r="0" b="0" l="0"/>
-            <wp:docPr id="13" name="" descr="" title=""/>
+            <wp:docPr id="23" name="" descr="" title=""/>
             <wp:cNvGraphicFramePr>
               <a:graphicFrameLocks xmlns:a="http://schemas.openxmlformats.org/drawingml/2006/main" noChangeAspect="1"/>
             </wp:cNvGraphicFramePr>
@@ -47271,7 +47731,7 @@
                     </pic:cNvPicPr>
                   </pic:nvPicPr>
                   <pic:blipFill>
-                    <a:blip r:embed="rId21" cstate="none"/>
+                    <a:blip r:embed="rId31" cstate="none"/>
                     <a:srcRect/>
                     <a:stretch>
                       <a:fillRect/>
@@ -50511,7 +50971,7 @@
           <wp:inline distT="0" distB="0" distL="0" distR="0">
             <wp:extent cx="4762500" cy="1600200"/>
             <wp:effectExtent t="0" r="0" b="0" l="0"/>
-            <wp:docPr id="14" name="" descr="" title=""/>
+            <wp:docPr id="24" name="" descr="" title=""/>
             <wp:cNvGraphicFramePr>
               <a:graphicFrameLocks xmlns:a="http://schemas.openxmlformats.org/drawingml/2006/main" noChangeAspect="1"/>
             </wp:cNvGraphicFramePr>
@@ -50525,7 +50985,7 @@
                     </pic:cNvPicPr>
                   </pic:nvPicPr>
                   <pic:blipFill>
-                    <a:blip r:embed="rId22" cstate="none"/>
+                    <a:blip r:embed="rId32" cstate="none"/>
                     <a:srcRect/>
                     <a:stretch>
                       <a:fillRect/>

</xml_diff>